<commit_message>
added minimumm viable product specification
</commit_message>
<xml_diff>
--- a/structure and planning.docx
+++ b/structure and planning.docx
@@ -2,6 +2,40 @@
 <file path=word/document.xml><?xml version="1.0" encoding="utf-8"?>
 <w:document xmlns:wpc="http://schemas.microsoft.com/office/word/2010/wordprocessingCanvas" xmlns:mc="http://schemas.openxmlformats.org/markup-compatibility/2006" xmlns:o="urn:schemas-microsoft-com:office:office" xmlns:r="http://schemas.openxmlformats.org/officeDocument/2006/relationships" xmlns:m="http://schemas.openxmlformats.org/officeDocument/2006/math" xmlns:v="urn:schemas-microsoft-com:vml" xmlns:wp14="http://schemas.microsoft.com/office/word/2010/wordprocessingDrawing" xmlns:wp="http://schemas.openxmlformats.org/drawingml/2006/wordprocessingDrawing" xmlns:w="http://schemas.openxmlformats.org/wordprocessingml/2006/main" xmlns:w14="http://schemas.microsoft.com/office/word/2010/wordml" xmlns:w10="urn:schemas-microsoft-com:office:word" xmlns:w15="http://schemas.microsoft.com/office/word/2012/wordml" xmlns:wpg="http://schemas.microsoft.com/office/word/2010/wordprocessingGroup" xmlns:wpi="http://schemas.microsoft.com/office/word/2010/wordprocessingInk" xmlns:wne="http://schemas.microsoft.com/office/word/2006/wordml" xmlns:wps="http://schemas.microsoft.com/office/word/2010/wordprocessingShape" xmlns:wpsCustomData="http://www.wps.cn/officeDocument/2013/wpsCustomData" mc:Ignorable="w14 w15 wp14">
   <w:body>
+    <w:p>
+      <w:pPr>
+        <w:rPr>
+          <w:rFonts w:hint="default"/>
+          <w:lang w:val="en-GB"/>
+        </w:rPr>
+      </w:pPr>
+      <w:r>
+        <w:rPr>
+          <w:rFonts w:hint="default"/>
+          <w:lang w:val="en-GB"/>
+        </w:rPr>
+        <w:t>Goal: Making a ERS manager that optimizes lap-time. Qualifying or Racing.</w:t>
+      </w:r>
+    </w:p>
+    <w:p>
+      <w:pPr>
+        <w:rPr>
+          <w:rFonts w:hint="default"/>
+          <w:lang w:val="en-GB"/>
+        </w:rPr>
+      </w:pPr>
+    </w:p>
+    <w:p>
+      <w:pPr>
+        <w:rPr>
+          <w:rFonts w:hint="default"/>
+          <w:lang w:val="en-GB"/>
+        </w:rPr>
+      </w:pPr>
+      <w:bookmarkStart w:id="0" w:name="_GoBack"/>
+      <w:bookmarkEnd w:id="0"/>
+    </w:p>
+    <w:p/>
     <w:p>
       <w:r>
         <w:drawing>
@@ -62,7 +96,9 @@
         </w:tblBorders>
         <w:tblLayout w:type="autofit"/>
         <w:tblCellMar>
+          <w:top w:w="0" w:type="dxa"/>
           <w:left w:w="108" w:type="dxa"/>
+          <w:bottom w:w="0" w:type="dxa"/>
           <w:right w:w="108" w:type="dxa"/>
         </w:tblCellMar>
       </w:tblPr>
@@ -82,7 +118,9 @@
             <w:insideV w:val="single" w:color="auto" w:sz="4" w:space="0"/>
           </w:tblBorders>
           <w:tblCellMar>
+            <w:top w:w="0" w:type="dxa"/>
             <w:left w:w="108" w:type="dxa"/>
+            <w:bottom w:w="0" w:type="dxa"/>
             <w:right w:w="108" w:type="dxa"/>
           </w:tblCellMar>
         </w:tblPrEx>
@@ -92,7 +130,9 @@
           </w:tcPr>
           <w:p>
             <w:pPr>
-              <w:spacing w:line="240" w:lineRule="auto"/>
+              <w:widowControl w:val="0"/>
+              <w:spacing w:line="240" w:lineRule="auto"/>
+              <w:jc w:val="both"/>
               <w:rPr>
                 <w:rFonts w:hint="default" w:ascii="Calibri" w:hAnsi="Calibri" w:cs="Calibri"/>
                 <w:sz w:val="22"/>
@@ -119,7 +159,9 @@
           </w:tcPr>
           <w:p>
             <w:pPr>
-              <w:spacing w:line="240" w:lineRule="auto"/>
+              <w:widowControl w:val="0"/>
+              <w:spacing w:line="240" w:lineRule="auto"/>
+              <w:jc w:val="both"/>
               <w:rPr>
                 <w:rFonts w:hint="default" w:ascii="Calibri" w:hAnsi="Calibri" w:cs="Calibri"/>
                 <w:sz w:val="22"/>
@@ -146,7 +188,9 @@
           </w:tcPr>
           <w:p>
             <w:pPr>
-              <w:spacing w:line="240" w:lineRule="auto"/>
+              <w:widowControl w:val="0"/>
+              <w:spacing w:line="240" w:lineRule="auto"/>
+              <w:jc w:val="both"/>
               <w:rPr>
                 <w:rFonts w:hint="default" w:ascii="Calibri" w:hAnsi="Calibri" w:cs="Calibri"/>
                 <w:sz w:val="22"/>
@@ -179,7 +223,9 @@
             <w:insideV w:val="single" w:color="auto" w:sz="4" w:space="0"/>
           </w:tblBorders>
           <w:tblCellMar>
+            <w:top w:w="0" w:type="dxa"/>
             <w:left w:w="108" w:type="dxa"/>
+            <w:bottom w:w="0" w:type="dxa"/>
             <w:right w:w="108" w:type="dxa"/>
           </w:tblCellMar>
         </w:tblPrEx>
@@ -189,7 +235,9 @@
           </w:tcPr>
           <w:p>
             <w:pPr>
-              <w:spacing w:line="240" w:lineRule="auto"/>
+              <w:widowControl w:val="0"/>
+              <w:spacing w:line="240" w:lineRule="auto"/>
+              <w:jc w:val="both"/>
               <w:rPr>
                 <w:rFonts w:hint="default" w:ascii="Calibri" w:hAnsi="Calibri" w:cs="Calibri"/>
                 <w:sz w:val="22"/>
@@ -207,7 +255,9 @@
           </w:p>
           <w:p>
             <w:pPr>
-              <w:spacing w:line="240" w:lineRule="auto"/>
+              <w:widowControl w:val="0"/>
+              <w:spacing w:line="240" w:lineRule="auto"/>
+              <w:jc w:val="both"/>
               <w:rPr>
                 <w:rFonts w:hint="default" w:ascii="Calibri" w:hAnsi="Calibri" w:cs="Calibri"/>
                 <w:sz w:val="22"/>
@@ -223,7 +273,9 @@
           </w:tcPr>
           <w:p>
             <w:pPr>
-              <w:spacing w:line="240" w:lineRule="auto"/>
+              <w:widowControl w:val="0"/>
+              <w:spacing w:line="240" w:lineRule="auto"/>
+              <w:jc w:val="both"/>
               <w:rPr>
                 <w:rFonts w:hint="default" w:ascii="Calibri" w:hAnsi="Calibri" w:cs="Calibri"/>
                 <w:sz w:val="22"/>
@@ -239,7 +291,9 @@
           </w:tcPr>
           <w:p>
             <w:pPr>
-              <w:spacing w:line="240" w:lineRule="auto"/>
+              <w:widowControl w:val="0"/>
+              <w:spacing w:line="240" w:lineRule="auto"/>
+              <w:jc w:val="both"/>
               <w:rPr>
                 <w:rFonts w:hint="default" w:ascii="Calibri" w:hAnsi="Calibri" w:cs="Calibri"/>
                 <w:sz w:val="22"/>
@@ -267,7 +321,9 @@
           </w:p>
           <w:p>
             <w:pPr>
-              <w:spacing w:line="240" w:lineRule="auto"/>
+              <w:widowControl w:val="0"/>
+              <w:spacing w:line="240" w:lineRule="auto"/>
+              <w:jc w:val="both"/>
               <w:rPr>
                 <w:rFonts w:hint="default" w:ascii="Calibri" w:hAnsi="Calibri" w:cs="Calibri"/>
                 <w:sz w:val="22"/>
@@ -353,17 +409,21 @@
           </w:p>
           <w:p>
             <w:pPr>
-              <w:spacing w:line="240" w:lineRule="auto"/>
-              <w:rPr>
-                <w:rFonts w:hint="default" w:ascii="Calibri" w:hAnsi="Calibri" w:cs="Calibri"/>
-                <w:sz w:val="22"/>
-                <w:szCs w:val="22"/>
-              </w:rPr>
-            </w:pPr>
-          </w:p>
-          <w:p>
-            <w:pPr>
-              <w:spacing w:line="240" w:lineRule="auto"/>
+              <w:widowControl w:val="0"/>
+              <w:spacing w:line="240" w:lineRule="auto"/>
+              <w:jc w:val="both"/>
+              <w:rPr>
+                <w:rFonts w:hint="default" w:ascii="Calibri" w:hAnsi="Calibri" w:cs="Calibri"/>
+                <w:sz w:val="22"/>
+                <w:szCs w:val="22"/>
+              </w:rPr>
+            </w:pPr>
+          </w:p>
+          <w:p>
+            <w:pPr>
+              <w:widowControl w:val="0"/>
+              <w:spacing w:line="240" w:lineRule="auto"/>
+              <w:jc w:val="both"/>
               <w:rPr>
                 <w:rFonts w:hint="default" w:ascii="Calibri" w:hAnsi="Calibri" w:cs="Calibri"/>
                 <w:sz w:val="22"/>
@@ -393,7 +453,9 @@
             <w:insideV w:val="single" w:color="auto" w:sz="4" w:space="0"/>
           </w:tblBorders>
           <w:tblCellMar>
+            <w:top w:w="0" w:type="dxa"/>
             <w:left w:w="108" w:type="dxa"/>
+            <w:bottom w:w="0" w:type="dxa"/>
             <w:right w:w="108" w:type="dxa"/>
           </w:tblCellMar>
         </w:tblPrEx>
@@ -403,7 +465,9 @@
           </w:tcPr>
           <w:p>
             <w:pPr>
-              <w:spacing w:line="240" w:lineRule="auto"/>
+              <w:widowControl w:val="0"/>
+              <w:spacing w:line="240" w:lineRule="auto"/>
+              <w:jc w:val="both"/>
               <w:rPr>
                 <w:rFonts w:hint="default" w:ascii="Calibri" w:hAnsi="Calibri" w:cs="Calibri"/>
                 <w:sz w:val="22"/>
@@ -421,7 +485,9 @@
           </w:p>
           <w:p>
             <w:pPr>
-              <w:spacing w:line="240" w:lineRule="auto"/>
+              <w:widowControl w:val="0"/>
+              <w:spacing w:line="240" w:lineRule="auto"/>
+              <w:jc w:val="both"/>
               <w:rPr>
                 <w:rFonts w:hint="default" w:ascii="Calibri" w:hAnsi="Calibri" w:cs="Calibri"/>
                 <w:sz w:val="22"/>
@@ -437,7 +503,9 @@
           </w:tcPr>
           <w:p>
             <w:pPr>
-              <w:spacing w:line="240" w:lineRule="auto"/>
+              <w:widowControl w:val="0"/>
+              <w:spacing w:line="240" w:lineRule="auto"/>
+              <w:jc w:val="both"/>
               <w:rPr>
                 <w:rFonts w:hint="default" w:ascii="Calibri" w:hAnsi="Calibri" w:cs="Calibri"/>
                 <w:sz w:val="22"/>
@@ -455,7 +523,9 @@
           </w:p>
           <w:p>
             <w:pPr>
-              <w:spacing w:line="240" w:lineRule="auto"/>
+              <w:widowControl w:val="0"/>
+              <w:spacing w:line="240" w:lineRule="auto"/>
+              <w:jc w:val="both"/>
               <w:rPr>
                 <w:rFonts w:hint="default" w:ascii="Calibri" w:hAnsi="Calibri" w:cs="Calibri"/>
                 <w:sz w:val="22"/>
@@ -471,7 +541,9 @@
           </w:tcPr>
           <w:p>
             <w:pPr>
-              <w:spacing w:line="240" w:lineRule="auto"/>
+              <w:widowControl w:val="0"/>
+              <w:spacing w:line="240" w:lineRule="auto"/>
+              <w:jc w:val="both"/>
               <w:rPr>
                 <w:rFonts w:hint="default" w:ascii="Calibri" w:hAnsi="Calibri" w:cs="Calibri"/>
                 <w:sz w:val="22"/>
@@ -489,7 +561,9 @@
           </w:p>
           <w:p>
             <w:pPr>
-              <w:spacing w:line="240" w:lineRule="auto"/>
+              <w:widowControl w:val="0"/>
+              <w:spacing w:line="240" w:lineRule="auto"/>
+              <w:jc w:val="both"/>
               <w:rPr>
                 <w:rFonts w:hint="default" w:ascii="Calibri" w:hAnsi="Calibri" w:cs="Calibri"/>
                 <w:sz w:val="22"/>
@@ -507,7 +581,9 @@
           </w:p>
           <w:p>
             <w:pPr>
-              <w:spacing w:line="240" w:lineRule="auto"/>
+              <w:widowControl w:val="0"/>
+              <w:spacing w:line="240" w:lineRule="auto"/>
+              <w:jc w:val="both"/>
               <w:rPr>
                 <w:rFonts w:hint="default" w:ascii="Calibri" w:hAnsi="Calibri" w:cs="Calibri"/>
                 <w:sz w:val="22"/>
@@ -529,7 +605,9 @@
             <w:insideV w:val="single" w:color="auto" w:sz="4" w:space="0"/>
           </w:tblBorders>
           <w:tblCellMar>
+            <w:top w:w="0" w:type="dxa"/>
             <w:left w:w="108" w:type="dxa"/>
+            <w:bottom w:w="0" w:type="dxa"/>
             <w:right w:w="108" w:type="dxa"/>
           </w:tblCellMar>
         </w:tblPrEx>
@@ -539,7 +617,9 @@
           </w:tcPr>
           <w:p>
             <w:pPr>
-              <w:spacing w:line="240" w:lineRule="auto"/>
+              <w:widowControl w:val="0"/>
+              <w:spacing w:line="240" w:lineRule="auto"/>
+              <w:jc w:val="both"/>
               <w:rPr>
                 <w:rFonts w:hint="default" w:ascii="Calibri" w:hAnsi="Calibri" w:cs="Calibri"/>
                 <w:sz w:val="22"/>
@@ -557,7 +637,9 @@
           </w:p>
           <w:p>
             <w:pPr>
-              <w:spacing w:line="240" w:lineRule="auto"/>
+              <w:widowControl w:val="0"/>
+              <w:spacing w:line="240" w:lineRule="auto"/>
+              <w:jc w:val="both"/>
               <w:rPr>
                 <w:rFonts w:hint="default" w:ascii="Calibri" w:hAnsi="Calibri" w:cs="Calibri"/>
                 <w:sz w:val="22"/>
@@ -573,7 +655,9 @@
           </w:tcPr>
           <w:p>
             <w:pPr>
-              <w:spacing w:line="240" w:lineRule="auto"/>
+              <w:widowControl w:val="0"/>
+              <w:spacing w:line="240" w:lineRule="auto"/>
+              <w:jc w:val="both"/>
               <w:rPr>
                 <w:rFonts w:hint="default" w:ascii="Calibri" w:hAnsi="Calibri" w:cs="Calibri"/>
                 <w:sz w:val="22"/>
@@ -607,7 +691,9 @@
           </w:tcPr>
           <w:p>
             <w:pPr>
-              <w:spacing w:line="240" w:lineRule="auto"/>
+              <w:widowControl w:val="0"/>
+              <w:spacing w:line="240" w:lineRule="auto"/>
+              <w:jc w:val="both"/>
               <w:rPr>
                 <w:rFonts w:hint="default" w:ascii="Calibri" w:hAnsi="Calibri" w:cs="Calibri"/>
                 <w:sz w:val="22"/>
@@ -625,7 +711,9 @@
           </w:p>
           <w:p>
             <w:pPr>
-              <w:spacing w:line="240" w:lineRule="auto"/>
+              <w:widowControl w:val="0"/>
+              <w:spacing w:line="240" w:lineRule="auto"/>
+              <w:jc w:val="both"/>
               <w:rPr>
                 <w:rFonts w:hint="default" w:ascii="Calibri" w:hAnsi="Calibri" w:cs="Calibri"/>
                 <w:sz w:val="22"/>
@@ -643,17 +731,21 @@
           </w:p>
           <w:p>
             <w:pPr>
-              <w:spacing w:line="240" w:lineRule="auto"/>
-              <w:rPr>
-                <w:rFonts w:hint="default" w:ascii="Calibri" w:hAnsi="Calibri" w:cs="Calibri"/>
-                <w:sz w:val="22"/>
-                <w:szCs w:val="22"/>
-              </w:rPr>
-            </w:pPr>
-          </w:p>
-          <w:p>
-            <w:pPr>
-              <w:spacing w:line="240" w:lineRule="auto"/>
+              <w:widowControl w:val="0"/>
+              <w:spacing w:line="240" w:lineRule="auto"/>
+              <w:jc w:val="both"/>
+              <w:rPr>
+                <w:rFonts w:hint="default" w:ascii="Calibri" w:hAnsi="Calibri" w:cs="Calibri"/>
+                <w:sz w:val="22"/>
+                <w:szCs w:val="22"/>
+              </w:rPr>
+            </w:pPr>
+          </w:p>
+          <w:p>
+            <w:pPr>
+              <w:widowControl w:val="0"/>
+              <w:spacing w:line="240" w:lineRule="auto"/>
+              <w:jc w:val="both"/>
               <w:rPr>
                 <w:rFonts w:hint="default" w:ascii="Calibri" w:hAnsi="Calibri" w:cs="Calibri"/>
                 <w:sz w:val="22"/>
@@ -675,7 +767,9 @@
             <w:insideV w:val="single" w:color="auto" w:sz="4" w:space="0"/>
           </w:tblBorders>
           <w:tblCellMar>
+            <w:top w:w="0" w:type="dxa"/>
             <w:left w:w="108" w:type="dxa"/>
+            <w:bottom w:w="0" w:type="dxa"/>
             <w:right w:w="108" w:type="dxa"/>
           </w:tblCellMar>
         </w:tblPrEx>
@@ -685,7 +779,9 @@
           </w:tcPr>
           <w:p>
             <w:pPr>
-              <w:spacing w:line="240" w:lineRule="auto"/>
+              <w:widowControl w:val="0"/>
+              <w:spacing w:line="240" w:lineRule="auto"/>
+              <w:jc w:val="both"/>
               <w:rPr>
                 <w:rFonts w:hint="default" w:ascii="Calibri" w:hAnsi="Calibri" w:cs="Calibri"/>
                 <w:sz w:val="22"/>
@@ -703,7 +799,9 @@
           </w:p>
           <w:p>
             <w:pPr>
-              <w:spacing w:line="240" w:lineRule="auto"/>
+              <w:widowControl w:val="0"/>
+              <w:spacing w:line="240" w:lineRule="auto"/>
+              <w:jc w:val="both"/>
               <w:rPr>
                 <w:rFonts w:hint="default" w:ascii="Calibri" w:hAnsi="Calibri" w:cs="Calibri"/>
                 <w:sz w:val="22"/>
@@ -719,7 +817,9 @@
           </w:tcPr>
           <w:p>
             <w:pPr>
-              <w:spacing w:line="240" w:lineRule="auto"/>
+              <w:widowControl w:val="0"/>
+              <w:spacing w:line="240" w:lineRule="auto"/>
+              <w:jc w:val="both"/>
               <w:rPr>
                 <w:rFonts w:hint="default" w:ascii="Calibri" w:hAnsi="Calibri" w:cs="Calibri"/>
                 <w:sz w:val="22"/>
@@ -737,7 +837,9 @@
           </w:p>
           <w:p>
             <w:pPr>
-              <w:spacing w:line="240" w:lineRule="auto"/>
+              <w:widowControl w:val="0"/>
+              <w:spacing w:line="240" w:lineRule="auto"/>
+              <w:jc w:val="both"/>
               <w:rPr>
                 <w:rFonts w:hint="default" w:ascii="Calibri" w:hAnsi="Calibri" w:cs="Calibri"/>
                 <w:sz w:val="22"/>
@@ -753,7 +855,9 @@
           </w:tcPr>
           <w:p>
             <w:pPr>
-              <w:spacing w:line="240" w:lineRule="auto"/>
+              <w:widowControl w:val="0"/>
+              <w:spacing w:line="240" w:lineRule="auto"/>
+              <w:jc w:val="both"/>
               <w:rPr>
                 <w:rFonts w:hint="default" w:ascii="Calibri" w:hAnsi="Calibri" w:cs="Calibri"/>
                 <w:sz w:val="22"/>
@@ -771,7 +875,9 @@
           </w:p>
           <w:p>
             <w:pPr>
-              <w:spacing w:line="240" w:lineRule="auto"/>
+              <w:widowControl w:val="0"/>
+              <w:spacing w:line="240" w:lineRule="auto"/>
+              <w:jc w:val="both"/>
               <w:rPr>
                 <w:rFonts w:hint="default" w:ascii="Calibri" w:hAnsi="Calibri" w:cs="Calibri"/>
                 <w:sz w:val="22"/>
@@ -798,7 +904,9 @@
           </w:p>
           <w:p>
             <w:pPr>
-              <w:spacing w:line="240" w:lineRule="auto"/>
+              <w:widowControl w:val="0"/>
+              <w:spacing w:line="240" w:lineRule="auto"/>
+              <w:jc w:val="both"/>
               <w:rPr>
                 <w:rFonts w:hint="default" w:ascii="Calibri" w:hAnsi="Calibri" w:cs="Calibri"/>
                 <w:sz w:val="22"/>
@@ -825,7 +933,9 @@
           </w:p>
           <w:p>
             <w:pPr>
-              <w:spacing w:line="240" w:lineRule="auto"/>
+              <w:widowControl w:val="0"/>
+              <w:spacing w:line="240" w:lineRule="auto"/>
+              <w:jc w:val="both"/>
               <w:rPr>
                 <w:rFonts w:hint="default" w:ascii="Calibri" w:hAnsi="Calibri" w:cs="Calibri"/>
                 <w:sz w:val="22"/>
@@ -852,7 +962,9 @@
           </w:p>
           <w:p>
             <w:pPr>
-              <w:spacing w:line="240" w:lineRule="auto"/>
+              <w:widowControl w:val="0"/>
+              <w:spacing w:line="240" w:lineRule="auto"/>
+              <w:jc w:val="both"/>
               <w:rPr>
                 <w:rFonts w:hint="default" w:ascii="Calibri" w:hAnsi="Calibri" w:cs="Calibri"/>
                 <w:sz w:val="22"/>
@@ -870,7 +982,9 @@
           </w:p>
           <w:p>
             <w:pPr>
-              <w:spacing w:line="240" w:lineRule="auto"/>
+              <w:widowControl w:val="0"/>
+              <w:spacing w:line="240" w:lineRule="auto"/>
+              <w:jc w:val="both"/>
               <w:rPr>
                 <w:rFonts w:hint="default" w:ascii="Calibri" w:hAnsi="Calibri" w:cs="Calibri"/>
                 <w:sz w:val="22"/>
@@ -892,7 +1006,9 @@
             <w:insideV w:val="single" w:color="auto" w:sz="4" w:space="0"/>
           </w:tblBorders>
           <w:tblCellMar>
+            <w:top w:w="0" w:type="dxa"/>
             <w:left w:w="108" w:type="dxa"/>
+            <w:bottom w:w="0" w:type="dxa"/>
             <w:right w:w="108" w:type="dxa"/>
           </w:tblCellMar>
         </w:tblPrEx>
@@ -902,7 +1018,9 @@
           </w:tcPr>
           <w:p>
             <w:pPr>
-              <w:spacing w:line="240" w:lineRule="auto"/>
+              <w:widowControl w:val="0"/>
+              <w:spacing w:line="240" w:lineRule="auto"/>
+              <w:jc w:val="both"/>
               <w:rPr>
                 <w:rFonts w:hint="default" w:ascii="Calibri" w:hAnsi="Calibri" w:cs="Calibri"/>
                 <w:sz w:val="22"/>
@@ -920,7 +1038,9 @@
           </w:p>
           <w:p>
             <w:pPr>
-              <w:spacing w:line="240" w:lineRule="auto"/>
+              <w:widowControl w:val="0"/>
+              <w:spacing w:line="240" w:lineRule="auto"/>
+              <w:jc w:val="both"/>
               <w:rPr>
                 <w:rFonts w:hint="default" w:ascii="Calibri" w:hAnsi="Calibri" w:cs="Calibri"/>
                 <w:sz w:val="22"/>
@@ -936,7 +1056,9 @@
           </w:tcPr>
           <w:p>
             <w:pPr>
-              <w:spacing w:line="240" w:lineRule="auto"/>
+              <w:widowControl w:val="0"/>
+              <w:spacing w:line="240" w:lineRule="auto"/>
+              <w:jc w:val="both"/>
               <w:rPr>
                 <w:rFonts w:hint="default" w:ascii="Calibri" w:hAnsi="Calibri" w:cs="Calibri"/>
                 <w:sz w:val="22"/>
@@ -954,7 +1076,9 @@
           </w:p>
           <w:p>
             <w:pPr>
-              <w:spacing w:line="240" w:lineRule="auto"/>
+              <w:widowControl w:val="0"/>
+              <w:spacing w:line="240" w:lineRule="auto"/>
+              <w:jc w:val="both"/>
               <w:rPr>
                 <w:rFonts w:hint="default" w:ascii="Calibri" w:hAnsi="Calibri" w:cs="Calibri"/>
                 <w:sz w:val="22"/>
@@ -972,7 +1096,9 @@
           </w:p>
           <w:p>
             <w:pPr>
-              <w:spacing w:line="240" w:lineRule="auto"/>
+              <w:widowControl w:val="0"/>
+              <w:spacing w:line="240" w:lineRule="auto"/>
+              <w:jc w:val="both"/>
               <w:rPr>
                 <w:rFonts w:hint="default" w:ascii="Calibri" w:hAnsi="Calibri" w:cs="Calibri"/>
                 <w:sz w:val="22"/>
@@ -988,7 +1114,9 @@
           </w:tcPr>
           <w:p>
             <w:pPr>
-              <w:spacing w:line="240" w:lineRule="auto"/>
+              <w:widowControl w:val="0"/>
+              <w:spacing w:line="240" w:lineRule="auto"/>
+              <w:jc w:val="both"/>
               <w:rPr>
                 <w:rFonts w:hint="default" w:ascii="Calibri" w:hAnsi="Calibri" w:cs="Calibri"/>
                 <w:sz w:val="22"/>
@@ -1016,7 +1144,9 @@
           </w:p>
           <w:p>
             <w:pPr>
-              <w:spacing w:line="240" w:lineRule="auto"/>
+              <w:widowControl w:val="0"/>
+              <w:spacing w:line="240" w:lineRule="auto"/>
+              <w:jc w:val="both"/>
               <w:rPr>
                 <w:rFonts w:hint="default" w:ascii="Calibri" w:hAnsi="Calibri" w:cs="Calibri"/>
                 <w:sz w:val="22"/>
@@ -1043,7 +1173,9 @@
           </w:p>
           <w:p>
             <w:pPr>
-              <w:spacing w:line="240" w:lineRule="auto"/>
+              <w:widowControl w:val="0"/>
+              <w:spacing w:line="240" w:lineRule="auto"/>
+              <w:jc w:val="both"/>
               <w:rPr>
                 <w:rFonts w:hint="default" w:ascii="Calibri" w:hAnsi="Calibri" w:cs="Calibri"/>
                 <w:sz w:val="22"/>
@@ -1070,7 +1202,9 @@
           </w:p>
           <w:p>
             <w:pPr>
-              <w:spacing w:line="240" w:lineRule="auto"/>
+              <w:widowControl w:val="0"/>
+              <w:spacing w:line="240" w:lineRule="auto"/>
+              <w:jc w:val="both"/>
               <w:rPr>
                 <w:rFonts w:hint="default" w:ascii="Calibri" w:hAnsi="Calibri" w:cs="Calibri"/>
                 <w:sz w:val="22"/>
@@ -1088,7 +1222,9 @@
           </w:p>
           <w:p>
             <w:pPr>
-              <w:spacing w:line="240" w:lineRule="auto"/>
+              <w:widowControl w:val="0"/>
+              <w:spacing w:line="240" w:lineRule="auto"/>
+              <w:jc w:val="both"/>
               <w:rPr>
                 <w:rFonts w:hint="default" w:ascii="Calibri" w:hAnsi="Calibri" w:cs="Calibri"/>
                 <w:sz w:val="22"/>
@@ -1115,7 +1251,9 @@
           </w:p>
           <w:p>
             <w:pPr>
-              <w:spacing w:line="240" w:lineRule="auto"/>
+              <w:widowControl w:val="0"/>
+              <w:spacing w:line="240" w:lineRule="auto"/>
+              <w:jc w:val="both"/>
               <w:rPr>
                 <w:rFonts w:hint="default" w:ascii="Calibri" w:hAnsi="Calibri" w:cs="Calibri"/>
                 <w:sz w:val="22"/>
@@ -1142,7 +1280,9 @@
           </w:p>
           <w:p>
             <w:pPr>
-              <w:spacing w:line="240" w:lineRule="auto"/>
+              <w:widowControl w:val="0"/>
+              <w:spacing w:line="240" w:lineRule="auto"/>
+              <w:jc w:val="both"/>
               <w:rPr>
                 <w:rFonts w:hint="default" w:ascii="Calibri" w:hAnsi="Calibri" w:cs="Calibri"/>
                 <w:sz w:val="22"/>
@@ -1169,7 +1309,9 @@
           </w:p>
           <w:p>
             <w:pPr>
-              <w:spacing w:line="240" w:lineRule="auto"/>
+              <w:widowControl w:val="0"/>
+              <w:spacing w:line="240" w:lineRule="auto"/>
+              <w:jc w:val="both"/>
               <w:rPr>
                 <w:rFonts w:hint="default" w:ascii="Calibri" w:hAnsi="Calibri" w:cs="Calibri"/>
                 <w:sz w:val="22"/>
@@ -1199,7 +1341,9 @@
             <w:insideV w:val="single" w:color="auto" w:sz="4" w:space="0"/>
           </w:tblBorders>
           <w:tblCellMar>
+            <w:top w:w="0" w:type="dxa"/>
             <w:left w:w="108" w:type="dxa"/>
+            <w:bottom w:w="0" w:type="dxa"/>
             <w:right w:w="108" w:type="dxa"/>
           </w:tblCellMar>
         </w:tblPrEx>
@@ -1209,7 +1353,9 @@
           </w:tcPr>
           <w:p>
             <w:pPr>
-              <w:spacing w:line="240" w:lineRule="auto"/>
+              <w:widowControl w:val="0"/>
+              <w:spacing w:line="240" w:lineRule="auto"/>
+              <w:jc w:val="both"/>
               <w:rPr>
                 <w:rFonts w:hint="default" w:ascii="Calibri" w:hAnsi="Calibri" w:cs="Calibri"/>
                 <w:sz w:val="22"/>
@@ -1227,7 +1373,9 @@
           </w:p>
           <w:p>
             <w:pPr>
-              <w:spacing w:line="240" w:lineRule="auto"/>
+              <w:widowControl w:val="0"/>
+              <w:spacing w:line="240" w:lineRule="auto"/>
+              <w:jc w:val="both"/>
               <w:rPr>
                 <w:rFonts w:hint="default" w:ascii="Calibri" w:hAnsi="Calibri" w:cs="Calibri"/>
                 <w:sz w:val="22"/>
@@ -1243,7 +1391,9 @@
           </w:tcPr>
           <w:p>
             <w:pPr>
-              <w:spacing w:line="240" w:lineRule="auto"/>
+              <w:widowControl w:val="0"/>
+              <w:spacing w:line="240" w:lineRule="auto"/>
+              <w:jc w:val="both"/>
               <w:rPr>
                 <w:rFonts w:hint="default" w:ascii="Calibri" w:hAnsi="Calibri" w:cs="Calibri"/>
                 <w:sz w:val="22"/>
@@ -1261,7 +1411,9 @@
           </w:p>
           <w:p>
             <w:pPr>
-              <w:spacing w:line="240" w:lineRule="auto"/>
+              <w:widowControl w:val="0"/>
+              <w:spacing w:line="240" w:lineRule="auto"/>
+              <w:jc w:val="both"/>
               <w:rPr>
                 <w:rFonts w:hint="default" w:ascii="Calibri" w:hAnsi="Calibri" w:cs="Calibri"/>
                 <w:sz w:val="22"/>
@@ -1277,7 +1429,9 @@
           </w:tcPr>
           <w:p>
             <w:pPr>
-              <w:spacing w:line="240" w:lineRule="auto"/>
+              <w:widowControl w:val="0"/>
+              <w:spacing w:line="240" w:lineRule="auto"/>
+              <w:jc w:val="both"/>
               <w:rPr>
                 <w:rFonts w:hint="default" w:ascii="Calibri" w:hAnsi="Calibri" w:cs="Calibri"/>
                 <w:sz w:val="22"/>
@@ -1295,7 +1449,9 @@
           </w:p>
           <w:p>
             <w:pPr>
-              <w:spacing w:line="240" w:lineRule="auto"/>
+              <w:widowControl w:val="0"/>
+              <w:spacing w:line="240" w:lineRule="auto"/>
+              <w:jc w:val="both"/>
               <w:rPr>
                 <w:rFonts w:hint="default" w:ascii="Calibri" w:hAnsi="Calibri" w:cs="Calibri"/>
                 <w:sz w:val="22"/>
@@ -1322,7 +1478,9 @@
           </w:p>
           <w:p>
             <w:pPr>
-              <w:spacing w:line="240" w:lineRule="auto"/>
+              <w:widowControl w:val="0"/>
+              <w:spacing w:line="240" w:lineRule="auto"/>
+              <w:jc w:val="both"/>
               <w:rPr>
                 <w:rFonts w:hint="default" w:ascii="Calibri" w:hAnsi="Calibri" w:cs="Calibri"/>
                 <w:sz w:val="22"/>
@@ -1349,7 +1507,9 @@
           </w:p>
           <w:p>
             <w:pPr>
-              <w:spacing w:line="240" w:lineRule="auto"/>
+              <w:widowControl w:val="0"/>
+              <w:spacing w:line="240" w:lineRule="auto"/>
+              <w:jc w:val="both"/>
               <w:rPr>
                 <w:rFonts w:hint="default" w:ascii="Calibri" w:hAnsi="Calibri" w:cs="Calibri"/>
                 <w:sz w:val="22"/>
@@ -1376,7 +1536,9 @@
           </w:p>
           <w:p>
             <w:pPr>
-              <w:spacing w:line="240" w:lineRule="auto"/>
+              <w:widowControl w:val="0"/>
+              <w:spacing w:line="240" w:lineRule="auto"/>
+              <w:jc w:val="both"/>
               <w:rPr>
                 <w:rFonts w:hint="default" w:ascii="Calibri" w:hAnsi="Calibri" w:cs="Calibri"/>
                 <w:sz w:val="22"/>
@@ -1403,7 +1565,9 @@
           </w:p>
           <w:p>
             <w:pPr>
-              <w:spacing w:line="240" w:lineRule="auto"/>
+              <w:widowControl w:val="0"/>
+              <w:spacing w:line="240" w:lineRule="auto"/>
+              <w:jc w:val="both"/>
               <w:rPr>
                 <w:rFonts w:hint="default" w:ascii="Calibri" w:hAnsi="Calibri" w:cs="Calibri"/>
                 <w:sz w:val="22"/>
@@ -1421,7 +1585,9 @@
           </w:p>
           <w:p>
             <w:pPr>
-              <w:spacing w:line="240" w:lineRule="auto"/>
+              <w:widowControl w:val="0"/>
+              <w:spacing w:line="240" w:lineRule="auto"/>
+              <w:jc w:val="both"/>
               <w:rPr>
                 <w:rFonts w:hint="default" w:ascii="Calibri" w:hAnsi="Calibri" w:cs="Calibri"/>
                 <w:sz w:val="22"/>
@@ -1451,7 +1617,9 @@
             <w:insideV w:val="single" w:color="auto" w:sz="4" w:space="0"/>
           </w:tblBorders>
           <w:tblCellMar>
+            <w:top w:w="0" w:type="dxa"/>
             <w:left w:w="108" w:type="dxa"/>
+            <w:bottom w:w="0" w:type="dxa"/>
             <w:right w:w="108" w:type="dxa"/>
           </w:tblCellMar>
         </w:tblPrEx>
@@ -1461,7 +1629,9 @@
           </w:tcPr>
           <w:p>
             <w:pPr>
-              <w:spacing w:line="240" w:lineRule="auto"/>
+              <w:widowControl w:val="0"/>
+              <w:spacing w:line="240" w:lineRule="auto"/>
+              <w:jc w:val="both"/>
               <w:rPr>
                 <w:rFonts w:hint="default" w:ascii="Calibri" w:hAnsi="Calibri" w:cs="Calibri"/>
                 <w:sz w:val="22"/>
@@ -1485,7 +1655,9 @@
           </w:tcPr>
           <w:p>
             <w:pPr>
-              <w:spacing w:line="240" w:lineRule="auto"/>
+              <w:widowControl w:val="0"/>
+              <w:spacing w:line="240" w:lineRule="auto"/>
+              <w:jc w:val="both"/>
               <w:rPr>
                 <w:rFonts w:hint="default" w:ascii="Calibri" w:hAnsi="Calibri" w:cs="Calibri"/>
                 <w:sz w:val="22"/>
@@ -1512,7 +1684,9 @@
           </w:tcPr>
           <w:p>
             <w:pPr>
-              <w:spacing w:line="240" w:lineRule="auto"/>
+              <w:widowControl w:val="0"/>
+              <w:spacing w:line="240" w:lineRule="auto"/>
+              <w:jc w:val="both"/>
               <w:rPr>
                 <w:rFonts w:hint="default" w:ascii="Calibri" w:hAnsi="Calibri" w:cs="Calibri"/>
                 <w:sz w:val="22"/>
@@ -1530,7 +1704,9 @@
           </w:p>
           <w:p>
             <w:pPr>
-              <w:spacing w:line="240" w:lineRule="auto"/>
+              <w:widowControl w:val="0"/>
+              <w:spacing w:line="240" w:lineRule="auto"/>
+              <w:jc w:val="both"/>
               <w:rPr>
                 <w:rFonts w:hint="default" w:ascii="Calibri" w:hAnsi="Calibri" w:cs="Calibri"/>
                 <w:sz w:val="22"/>
@@ -1548,7 +1724,9 @@
           </w:p>
           <w:p>
             <w:pPr>
-              <w:spacing w:line="240" w:lineRule="auto"/>
+              <w:widowControl w:val="0"/>
+              <w:spacing w:line="240" w:lineRule="auto"/>
+              <w:jc w:val="both"/>
               <w:rPr>
                 <w:rFonts w:hint="default" w:ascii="Calibri" w:hAnsi="Calibri" w:cs="Calibri"/>
                 <w:sz w:val="22"/>
@@ -1583,7 +1761,9 @@
           </w:p>
           <w:p>
             <w:pPr>
-              <w:spacing w:line="240" w:lineRule="auto"/>
+              <w:widowControl w:val="0"/>
+              <w:spacing w:line="240" w:lineRule="auto"/>
+              <w:jc w:val="both"/>
               <w:rPr>
                 <w:rFonts w:hint="default" w:ascii="Calibri" w:hAnsi="Calibri" w:cs="Calibri"/>
                 <w:sz w:val="22"/>
@@ -1618,7 +1798,9 @@
           </w:p>
           <w:p>
             <w:pPr>
-              <w:spacing w:line="240" w:lineRule="auto"/>
+              <w:widowControl w:val="0"/>
+              <w:spacing w:line="240" w:lineRule="auto"/>
+              <w:jc w:val="both"/>
               <w:rPr>
                 <w:rFonts w:hint="default" w:ascii="Calibri" w:hAnsi="Calibri" w:cs="Calibri"/>
                 <w:sz w:val="22"/>
@@ -1640,7 +1822,9 @@
             <w:insideV w:val="single" w:color="auto" w:sz="4" w:space="0"/>
           </w:tblBorders>
           <w:tblCellMar>
+            <w:top w:w="0" w:type="dxa"/>
             <w:left w:w="108" w:type="dxa"/>
+            <w:bottom w:w="0" w:type="dxa"/>
             <w:right w:w="108" w:type="dxa"/>
           </w:tblCellMar>
         </w:tblPrEx>
@@ -1650,7 +1834,9 @@
           </w:tcPr>
           <w:p>
             <w:pPr>
-              <w:spacing w:line="240" w:lineRule="auto"/>
+              <w:widowControl w:val="0"/>
+              <w:spacing w:line="240" w:lineRule="auto"/>
+              <w:jc w:val="both"/>
               <w:rPr>
                 <w:rFonts w:hint="default" w:ascii="Calibri" w:hAnsi="Calibri" w:cs="Calibri"/>
                 <w:sz w:val="22"/>
@@ -1674,7 +1860,9 @@
           </w:tcPr>
           <w:p>
             <w:pPr>
-              <w:spacing w:line="240" w:lineRule="auto"/>
+              <w:widowControl w:val="0"/>
+              <w:spacing w:line="240" w:lineRule="auto"/>
+              <w:jc w:val="both"/>
               <w:rPr>
                 <w:rFonts w:hint="default" w:ascii="Calibri" w:hAnsi="Calibri" w:cs="Calibri"/>
                 <w:sz w:val="22"/>
@@ -1698,7 +1886,9 @@
           </w:tcPr>
           <w:p>
             <w:pPr>
-              <w:spacing w:line="240" w:lineRule="auto"/>
+              <w:widowControl w:val="0"/>
+              <w:spacing w:line="240" w:lineRule="auto"/>
+              <w:jc w:val="both"/>
               <w:rPr>
                 <w:rFonts w:hint="default" w:ascii="Calibri" w:hAnsi="Calibri" w:cs="Calibri"/>
                 <w:sz w:val="22"/>
@@ -1750,7 +1940,9 @@
           </w:p>
           <w:p>
             <w:pPr>
-              <w:spacing w:line="240" w:lineRule="auto"/>
+              <w:widowControl w:val="0"/>
+              <w:spacing w:line="240" w:lineRule="auto"/>
+              <w:jc w:val="both"/>
               <w:rPr>
                 <w:rFonts w:hint="default" w:ascii="Calibri" w:hAnsi="Calibri" w:cs="Calibri"/>
                 <w:sz w:val="22"/>
@@ -1768,7 +1960,9 @@
           </w:p>
           <w:p>
             <w:pPr>
-              <w:spacing w:line="240" w:lineRule="auto"/>
+              <w:widowControl w:val="0"/>
+              <w:spacing w:line="240" w:lineRule="auto"/>
+              <w:jc w:val="both"/>
               <w:rPr>
                 <w:rFonts w:hint="default" w:ascii="Calibri" w:hAnsi="Calibri" w:cs="Calibri"/>
                 <w:sz w:val="22"/>
@@ -1795,7 +1989,9 @@
           </w:p>
           <w:p>
             <w:pPr>
-              <w:spacing w:line="240" w:lineRule="auto"/>
+              <w:widowControl w:val="0"/>
+              <w:spacing w:line="240" w:lineRule="auto"/>
+              <w:jc w:val="both"/>
               <w:rPr>
                 <w:rFonts w:hint="default" w:ascii="Calibri" w:hAnsi="Calibri" w:cs="Calibri"/>
                 <w:sz w:val="22"/>
@@ -1822,7 +2018,9 @@
           </w:p>
           <w:p>
             <w:pPr>
-              <w:spacing w:line="240" w:lineRule="auto"/>
+              <w:widowControl w:val="0"/>
+              <w:spacing w:line="240" w:lineRule="auto"/>
+              <w:jc w:val="both"/>
               <w:rPr>
                 <w:rFonts w:hint="default" w:ascii="Calibri" w:hAnsi="Calibri" w:cs="Calibri"/>
                 <w:sz w:val="22"/>
@@ -1849,7 +2047,9 @@
           </w:p>
           <w:p>
             <w:pPr>
-              <w:spacing w:line="240" w:lineRule="auto"/>
+              <w:widowControl w:val="0"/>
+              <w:spacing w:line="240" w:lineRule="auto"/>
+              <w:jc w:val="both"/>
               <w:rPr>
                 <w:rFonts w:hint="default" w:ascii="Calibri" w:hAnsi="Calibri" w:cs="Calibri"/>
                 <w:sz w:val="22"/>
@@ -1876,7 +2076,9 @@
           </w:p>
           <w:p>
             <w:pPr>
-              <w:spacing w:line="240" w:lineRule="auto"/>
+              <w:widowControl w:val="0"/>
+              <w:spacing w:line="240" w:lineRule="auto"/>
+              <w:jc w:val="both"/>
               <w:rPr>
                 <w:rFonts w:hint="default" w:ascii="Calibri" w:hAnsi="Calibri" w:cs="Calibri"/>
                 <w:sz w:val="22"/>
@@ -1894,7 +2096,9 @@
           </w:p>
           <w:p>
             <w:pPr>
-              <w:spacing w:line="240" w:lineRule="auto"/>
+              <w:widowControl w:val="0"/>
+              <w:spacing w:line="240" w:lineRule="auto"/>
+              <w:jc w:val="both"/>
               <w:rPr>
                 <w:rFonts w:hint="default" w:ascii="Calibri" w:hAnsi="Calibri" w:cs="Calibri"/>
                 <w:sz w:val="22"/>
@@ -1921,7 +2125,9 @@
           </w:p>
           <w:p>
             <w:pPr>
-              <w:spacing w:line="240" w:lineRule="auto"/>
+              <w:widowControl w:val="0"/>
+              <w:spacing w:line="240" w:lineRule="auto"/>
+              <w:jc w:val="both"/>
               <w:rPr>
                 <w:rFonts w:hint="default" w:ascii="Calibri" w:hAnsi="Calibri" w:cs="Calibri"/>
                 <w:sz w:val="22"/>
@@ -1948,7 +2154,9 @@
           </w:p>
           <w:p>
             <w:pPr>
-              <w:spacing w:line="240" w:lineRule="auto"/>
+              <w:widowControl w:val="0"/>
+              <w:spacing w:line="240" w:lineRule="auto"/>
+              <w:jc w:val="both"/>
               <w:rPr>
                 <w:rFonts w:hint="default" w:ascii="Calibri" w:hAnsi="Calibri" w:cs="Calibri"/>
                 <w:sz w:val="22"/>
@@ -1975,7 +2183,9 @@
           </w:p>
           <w:p>
             <w:pPr>
-              <w:spacing w:line="240" w:lineRule="auto"/>
+              <w:widowControl w:val="0"/>
+              <w:spacing w:line="240" w:lineRule="auto"/>
+              <w:jc w:val="both"/>
               <w:rPr>
                 <w:rFonts w:hint="default" w:ascii="Calibri" w:hAnsi="Calibri" w:cs="Calibri"/>
                 <w:sz w:val="22"/>
@@ -2002,17 +2212,21 @@
           </w:p>
           <w:p>
             <w:pPr>
-              <w:spacing w:line="240" w:lineRule="auto"/>
-              <w:rPr>
-                <w:rFonts w:hint="default" w:ascii="Calibri" w:hAnsi="Calibri" w:cs="Calibri"/>
-                <w:sz w:val="22"/>
-                <w:szCs w:val="22"/>
-              </w:rPr>
-            </w:pPr>
-          </w:p>
-          <w:p>
-            <w:pPr>
-              <w:spacing w:line="240" w:lineRule="auto"/>
+              <w:widowControl w:val="0"/>
+              <w:spacing w:line="240" w:lineRule="auto"/>
+              <w:jc w:val="both"/>
+              <w:rPr>
+                <w:rFonts w:hint="default" w:ascii="Calibri" w:hAnsi="Calibri" w:cs="Calibri"/>
+                <w:sz w:val="22"/>
+                <w:szCs w:val="22"/>
+              </w:rPr>
+            </w:pPr>
+          </w:p>
+          <w:p>
+            <w:pPr>
+              <w:widowControl w:val="0"/>
+              <w:spacing w:line="240" w:lineRule="auto"/>
+              <w:jc w:val="both"/>
               <w:rPr>
                 <w:rFonts w:hint="default" w:ascii="Calibri" w:hAnsi="Calibri" w:cs="Calibri"/>
                 <w:sz w:val="22"/>
@@ -2030,7 +2244,9 @@
           </w:p>
           <w:p>
             <w:pPr>
-              <w:spacing w:line="240" w:lineRule="auto"/>
+              <w:widowControl w:val="0"/>
+              <w:spacing w:line="240" w:lineRule="auto"/>
+              <w:jc w:val="both"/>
               <w:rPr>
                 <w:rFonts w:hint="default" w:ascii="Calibri" w:hAnsi="Calibri" w:cs="Calibri"/>
                 <w:sz w:val="22"/>
@@ -2077,7 +2293,9 @@
             <w:insideV w:val="single" w:color="auto" w:sz="4" w:space="0"/>
           </w:tblBorders>
           <w:tblCellMar>
+            <w:top w:w="0" w:type="dxa"/>
             <w:left w:w="108" w:type="dxa"/>
+            <w:bottom w:w="0" w:type="dxa"/>
             <w:right w:w="108" w:type="dxa"/>
           </w:tblCellMar>
         </w:tblPrEx>
@@ -2087,7 +2305,9 @@
           </w:tcPr>
           <w:p>
             <w:pPr>
-              <w:spacing w:line="240" w:lineRule="auto"/>
+              <w:widowControl w:val="0"/>
+              <w:spacing w:line="240" w:lineRule="auto"/>
+              <w:jc w:val="both"/>
               <w:rPr>
                 <w:rFonts w:hint="default" w:ascii="Calibri" w:hAnsi="Calibri" w:cs="Calibri"/>
                 <w:sz w:val="22"/>
@@ -2102,7 +2322,9 @@
           </w:tcPr>
           <w:p>
             <w:pPr>
-              <w:spacing w:line="240" w:lineRule="auto"/>
+              <w:widowControl w:val="0"/>
+              <w:spacing w:line="240" w:lineRule="auto"/>
+              <w:jc w:val="both"/>
               <w:rPr>
                 <w:rFonts w:hint="default" w:ascii="Calibri" w:hAnsi="Calibri" w:cs="Calibri"/>
                 <w:sz w:val="22"/>
@@ -2117,7 +2339,9 @@
           </w:tcPr>
           <w:p>
             <w:pPr>
-              <w:spacing w:line="240" w:lineRule="auto"/>
+              <w:widowControl w:val="0"/>
+              <w:spacing w:line="240" w:lineRule="auto"/>
+              <w:jc w:val="both"/>
               <w:rPr>
                 <w:rFonts w:hint="default" w:ascii="Calibri" w:hAnsi="Calibri" w:cs="Calibri"/>
                 <w:sz w:val="22"/>
@@ -2698,8 +2922,6 @@
           <w:szCs w:val="22"/>
         </w:rPr>
       </w:pPr>
-      <w:bookmarkStart w:id="0" w:name="_GoBack"/>
-      <w:bookmarkEnd w:id="0"/>
     </w:p>
     <w:sectPr>
       <w:pgSz w:w="11906" w:h="16838"/>
@@ -2787,7 +3009,7 @@
     <w:lsdException w:qFormat="1" w:unhideWhenUsed="0" w:uiPriority="0" w:semiHidden="0" w:name="Title"/>
     <w:lsdException w:unhideWhenUsed="0" w:uiPriority="0" w:semiHidden="0" w:name="Closing"/>
     <w:lsdException w:unhideWhenUsed="0" w:uiPriority="0" w:semiHidden="0" w:name="Signature"/>
-    <w:lsdException w:unhideWhenUsed="0" w:uiPriority="0" w:name="Default Paragraph Font"/>
+    <w:lsdException w:qFormat="1" w:unhideWhenUsed="0" w:uiPriority="0" w:name="Default Paragraph Font"/>
     <w:lsdException w:unhideWhenUsed="0" w:uiPriority="0" w:semiHidden="0" w:name="Body Text"/>
     <w:lsdException w:unhideWhenUsed="0" w:uiPriority="0" w:semiHidden="0" w:name="Body Text Indent"/>
     <w:lsdException w:unhideWhenUsed="0" w:uiPriority="0" w:semiHidden="0" w:name="List Continue"/>
@@ -2814,14 +3036,14 @@
     <w:lsdException w:unhideWhenUsed="0" w:uiPriority="0" w:semiHidden="0" w:name="Document Map"/>
     <w:lsdException w:unhideWhenUsed="0" w:uiPriority="0" w:semiHidden="0" w:name="Plain Text"/>
     <w:lsdException w:unhideWhenUsed="0" w:uiPriority="0" w:semiHidden="0" w:name="E-mail Signature"/>
-    <w:lsdException w:unhideWhenUsed="0" w:uiPriority="0" w:semiHidden="0" w:name="Normal (Web)"/>
+    <w:lsdException w:qFormat="1" w:unhideWhenUsed="0" w:uiPriority="0" w:semiHidden="0" w:name="Normal (Web)"/>
     <w:lsdException w:unhideWhenUsed="0" w:uiPriority="0" w:semiHidden="0" w:name="HTML Acronym"/>
     <w:lsdException w:unhideWhenUsed="0" w:uiPriority="0" w:semiHidden="0" w:name="HTML Address"/>
     <w:lsdException w:unhideWhenUsed="0" w:uiPriority="0" w:semiHidden="0" w:name="HTML Cite"/>
-    <w:lsdException w:unhideWhenUsed="0" w:uiPriority="0" w:semiHidden="0" w:name="HTML Code"/>
+    <w:lsdException w:qFormat="1" w:unhideWhenUsed="0" w:uiPriority="0" w:semiHidden="0" w:name="HTML Code"/>
     <w:lsdException w:unhideWhenUsed="0" w:uiPriority="0" w:semiHidden="0" w:name="HTML Definition"/>
     <w:lsdException w:unhideWhenUsed="0" w:uiPriority="0" w:semiHidden="0" w:name="HTML Keyboard"/>
-    <w:lsdException w:unhideWhenUsed="0" w:uiPriority="0" w:semiHidden="0" w:name="HTML Preformatted"/>
+    <w:lsdException w:qFormat="1" w:unhideWhenUsed="0" w:uiPriority="0" w:semiHidden="0" w:name="HTML Preformatted"/>
     <w:lsdException w:unhideWhenUsed="0" w:uiPriority="0" w:semiHidden="0" w:name="HTML Sample"/>
     <w:lsdException w:unhideWhenUsed="0" w:uiPriority="0" w:semiHidden="0" w:name="HTML Typewriter"/>
     <w:lsdException w:unhideWhenUsed="0" w:uiPriority="0" w:semiHidden="0" w:name="HTML Variable"/>
@@ -2870,7 +3092,7 @@
     <w:lsdException w:unhideWhenUsed="0" w:uiPriority="0" w:semiHidden="0" w:name="Table Web 2"/>
     <w:lsdException w:unhideWhenUsed="0" w:uiPriority="0" w:semiHidden="0" w:name="Table Web 3"/>
     <w:lsdException w:unhideWhenUsed="0" w:uiPriority="0" w:semiHidden="0" w:name="Balloon Text"/>
-    <w:lsdException w:unhideWhenUsed="0" w:uiPriority="0" w:semiHidden="0" w:name="Table Grid"/>
+    <w:lsdException w:qFormat="1" w:unhideWhenUsed="0" w:uiPriority="0" w:semiHidden="0" w:name="Table Grid"/>
     <w:lsdException w:unhideWhenUsed="0" w:uiPriority="0" w:semiHidden="0" w:name="Table Theme"/>
     <w:lsdException w:unhideWhenUsed="0" w:uiPriority="60" w:semiHidden="0" w:name="Light Shading"/>
     <w:lsdException w:unhideWhenUsed="0" w:uiPriority="61" w:semiHidden="0" w:name="Light List"/>
@@ -3023,6 +3245,7 @@
   <w:style w:type="character" w:default="1" w:styleId="4">
     <w:name w:val="Default Paragraph Font"/>
     <w:semiHidden/>
+    <w:qFormat/>
     <w:uiPriority w:val="0"/>
   </w:style>
   <w:style w:type="table" w:default="1" w:styleId="5">
@@ -3042,6 +3265,7 @@
   <w:style w:type="character" w:styleId="6">
     <w:name w:val="HTML Code"/>
     <w:basedOn w:val="4"/>
+    <w:qFormat/>
     <w:uiPriority w:val="0"/>
     <w:rPr>
       <w:rFonts w:ascii="Courier New" w:hAnsi="Courier New" w:cs="Courier New"/>
@@ -3051,6 +3275,7 @@
   </w:style>
   <w:style w:type="paragraph" w:styleId="7">
     <w:name w:val="HTML Preformatted"/>
+    <w:qFormat/>
     <w:uiPriority w:val="0"/>
     <w:pPr>
       <w:tabs>
@@ -3083,6 +3308,7 @@
   </w:style>
   <w:style w:type="paragraph" w:styleId="8">
     <w:name w:val="Normal (Web)"/>
+    <w:qFormat/>
     <w:uiPriority w:val="0"/>
     <w:pPr>
       <w:spacing w:before="0" w:beforeAutospacing="1" w:after="0" w:afterAutospacing="1"/>
@@ -3090,6 +3316,7 @@
       <w:jc w:val="left"/>
     </w:pPr>
     <w:rPr>
+      <w:rFonts w:ascii="Times New Roman" w:hAnsi="Times New Roman" w:eastAsia="SimSun" w:cs="Times New Roman"/>
       <w:kern w:val="0"/>
       <w:sz w:val="24"/>
       <w:szCs w:val="24"/>
@@ -3109,6 +3336,7 @@
   <w:style w:type="table" w:styleId="10">
     <w:name w:val="Table Grid"/>
     <w:basedOn w:val="5"/>
+    <w:qFormat/>
     <w:uiPriority w:val="0"/>
     <w:pPr>
       <w:widowControl w:val="0"/>

</xml_diff>

<commit_message>
Added much more detail in CLAUDE.md about the context and relavent 2026 battery regulations
</commit_message>
<xml_diff>
--- a/structure and planning.docx
+++ b/structure and planning.docx
@@ -32,8 +32,6 @@
           <w:lang w:val="en-GB"/>
         </w:rPr>
       </w:pPr>
-      <w:bookmarkStart w:id="0" w:name="_GoBack"/>
-      <w:bookmarkEnd w:id="0"/>
     </w:p>
     <w:p/>
     <w:p>
@@ -83,7 +81,7 @@
     </w:p>
     <w:tbl>
       <w:tblPr>
-        <w:tblStyle w:val="10"/>
+        <w:tblStyle w:val="11"/>
         <w:tblW w:w="0" w:type="auto"/>
         <w:tblInd w:w="0" w:type="dxa"/>
         <w:tblBorders>
@@ -2911,6 +2909,233 @@
           <w:szCs w:val="22"/>
         </w:rPr>
         <w:t>Start implementing the Battery class.</w:t>
+      </w:r>
+    </w:p>
+    <w:p>
+      <w:pPr>
+        <w:spacing w:line="240" w:lineRule="auto"/>
+        <w:ind w:firstLine="720" w:firstLineChars="0"/>
+        <w:rPr>
+          <w:rFonts w:hint="default" w:ascii="Calibri" w:hAnsi="Calibri" w:cs="Calibri"/>
+          <w:sz w:val="22"/>
+          <w:szCs w:val="22"/>
+        </w:rPr>
+      </w:pPr>
+    </w:p>
+    <w:p>
+      <w:pPr>
+        <w:spacing w:line="240" w:lineRule="auto"/>
+        <w:rPr>
+          <w:rFonts w:hint="default" w:ascii="Calibri" w:hAnsi="Calibri" w:cs="Calibri"/>
+          <w:sz w:val="22"/>
+          <w:szCs w:val="22"/>
+        </w:rPr>
+      </w:pPr>
+    </w:p>
+    <w:p>
+      <w:pPr>
+        <w:spacing w:line="240" w:lineRule="auto"/>
+        <w:rPr>
+          <w:rFonts w:hint="default" w:ascii="Calibri" w:hAnsi="Calibri" w:cs="Calibri"/>
+          <w:b/>
+          <w:bCs/>
+          <w:sz w:val="32"/>
+          <w:szCs w:val="32"/>
+          <w:lang w:val="en-GB"/>
+        </w:rPr>
+      </w:pPr>
+      <w:r>
+        <w:rPr>
+          <w:rFonts w:hint="default" w:ascii="Calibri" w:hAnsi="Calibri" w:cs="Calibri"/>
+          <w:b/>
+          <w:bCs/>
+          <w:sz w:val="32"/>
+          <w:szCs w:val="32"/>
+          <w:lang w:val="en-GB"/>
+        </w:rPr>
+        <w:t xml:space="preserve">Minimum viable prototype: </w:t>
+      </w:r>
+    </w:p>
+    <w:p>
+      <w:pPr>
+        <w:pStyle w:val="9"/>
+        <w:keepNext w:val="0"/>
+        <w:keepLines w:val="0"/>
+        <w:pageBreakBefore w:val="0"/>
+        <w:widowControl/>
+        <w:suppressLineNumbers w:val="0"/>
+        <w:kinsoku/>
+        <w:wordWrap/>
+        <w:overflowPunct/>
+        <w:topLinePunct w:val="0"/>
+        <w:autoSpaceDE/>
+        <w:autoSpaceDN/>
+        <w:bidi w:val="0"/>
+        <w:adjustRightInd/>
+        <w:snapToGrid/>
+        <w:spacing w:before="0" w:beforeAutospacing="1" w:after="220" w:afterAutospacing="0"/>
+        <w:ind w:left="0" w:right="0"/>
+        <w:textAlignment w:val="auto"/>
+      </w:pPr>
+      <w:r>
+        <w:t>Think of it as three layers, each testable independently:</w:t>
+      </w:r>
+      <w:bookmarkStart w:id="0" w:name="_GoBack"/>
+      <w:bookmarkEnd w:id="0"/>
+    </w:p>
+    <w:p>
+      <w:pPr>
+        <w:pStyle w:val="9"/>
+        <w:keepNext w:val="0"/>
+        <w:keepLines w:val="0"/>
+        <w:widowControl/>
+        <w:suppressLineNumbers w:val="0"/>
+        <w:spacing w:before="0" w:beforeAutospacing="1" w:after="0" w:afterAutospacing="1"/>
+        <w:ind w:left="0" w:right="0"/>
+      </w:pPr>
+      <w:r>
+        <w:rPr>
+          <w:rStyle w:val="10"/>
+        </w:rPr>
+        <w:t xml:space="preserve">1. </w:t>
+      </w:r>
+      <w:r>
+        <w:rPr>
+          <w:rStyle w:val="7"/>
+        </w:rPr>
+        <w:t>Segment</w:t>
+      </w:r>
+      <w:r>
+        <w:rPr>
+          <w:rStyle w:val="10"/>
+        </w:rPr>
+        <w:t xml:space="preserve"> — the static track description</w:t>
+      </w:r>
+      <w:r>
+        <w:br w:type="textWrapping"/>
+      </w:r>
+      <w:r>
+        <w:t xml:space="preserve">This is pure data: what does this piece of track look like, physically? Fields like segment name/id, type (straight/corner/braking-zone), distance, and some representation of energy potential (however you choose to model it — could be a single "harvest potential" value, or separate demand/recovery values, that's your design decision). This layer knows nothing about </w:t>
+      </w:r>
+      <w:r>
+        <w:rPr>
+          <w:rStyle w:val="6"/>
+        </w:rPr>
+        <w:t>strategy</w:t>
+      </w:r>
+      <w:r>
+        <w:t xml:space="preserve"> — it's just "here's what Silverstone looks like," fixed regardless of what car or driver runs it.</w:t>
+      </w:r>
+    </w:p>
+    <w:p>
+      <w:pPr>
+        <w:pStyle w:val="9"/>
+        <w:keepNext w:val="0"/>
+        <w:keepLines w:val="0"/>
+        <w:widowControl/>
+        <w:suppressLineNumbers w:val="0"/>
+        <w:spacing w:before="0" w:beforeAutospacing="1" w:after="0" w:afterAutospacing="1"/>
+        <w:ind w:left="0" w:right="0"/>
+      </w:pPr>
+      <w:r>
+        <w:rPr>
+          <w:rStyle w:val="10"/>
+        </w:rPr>
+        <w:t xml:space="preserve">2. </w:t>
+      </w:r>
+      <w:r>
+        <w:rPr>
+          <w:rStyle w:val="7"/>
+        </w:rPr>
+        <w:t>BatteryState</w:t>
+      </w:r>
+      <w:r>
+        <w:rPr>
+          <w:rStyle w:val="10"/>
+        </w:rPr>
+        <w:t xml:space="preserve"> — the dynamic, changing part</w:t>
+      </w:r>
+      <w:r>
+        <w:br w:type="textWrapping"/>
+      </w:r>
+      <w:r>
+        <w:t xml:space="preserve">This tracks how much energy is currently stored (in MJ), and enforces the rules: the 4MJ cap, the 350kW deploy/recover rate limit (which really means: how much energy can physically move in/out during one segment, given its duration), and the track's per-lap harvest cap. This layer is where the </w:t>
+      </w:r>
+      <w:r>
+        <w:rPr>
+          <w:rStyle w:val="6"/>
+        </w:rPr>
+        <w:t>actual F1 regulation numbers</w:t>
+      </w:r>
+      <w:r>
+        <w:t xml:space="preserve"> live — it's the part of your code you'd point to and say "this enforces the real 2026 rules."</w:t>
+      </w:r>
+    </w:p>
+    <w:p>
+      <w:pPr>
+        <w:pStyle w:val="9"/>
+        <w:keepNext w:val="0"/>
+        <w:keepLines w:val="0"/>
+        <w:widowControl/>
+        <w:suppressLineNumbers w:val="0"/>
+        <w:spacing w:before="0" w:beforeAutospacing="1" w:after="0" w:afterAutospacing="1"/>
+        <w:ind w:left="0" w:right="0"/>
+      </w:pPr>
+      <w:r>
+        <w:rPr>
+          <w:rStyle w:val="10"/>
+        </w:rPr>
+        <w:t xml:space="preserve">3. The optimizer — where </w:t>
+      </w:r>
+      <w:r>
+        <w:rPr>
+          <w:rStyle w:val="7"/>
+        </w:rPr>
+        <w:t>Segment</w:t>
+      </w:r>
+      <w:r>
+        <w:rPr>
+          <w:rStyle w:val="10"/>
+        </w:rPr>
+        <w:t xml:space="preserve"> sequence meets </w:t>
+      </w:r>
+      <w:r>
+        <w:rPr>
+          <w:rStyle w:val="7"/>
+        </w:rPr>
+        <w:t>BatteryState</w:t>
+      </w:r>
+      <w:r>
+        <w:rPr>
+          <w:rStyle w:val="10"/>
+        </w:rPr>
+        <w:t xml:space="preserve"> over time</w:t>
+      </w:r>
+      <w:r>
+        <w:br w:type="textWrapping"/>
+      </w:r>
+      <w:r>
+        <w:t>This is your DP: given the fixed sequence of segments (the track) and the battery rules (the constraints), find the deployment/harvest decision at each segment that minimizes total lap time, for a given starting battery level. The "state" in your DP is (which segment you're at, how much battery you have) — and you're computing, for every possible battery level at every segment, what the best achievable remaining lap time is.</w:t>
+      </w:r>
+    </w:p>
+    <w:p>
+      <w:pPr>
+        <w:pStyle w:val="9"/>
+        <w:keepNext w:val="0"/>
+        <w:keepLines w:val="0"/>
+        <w:widowControl/>
+        <w:suppressLineNumbers w:val="0"/>
+        <w:spacing w:before="0" w:beforeAutospacing="1" w:after="0" w:afterAutospacing="1"/>
+        <w:ind w:left="0" w:right="0"/>
+      </w:pPr>
+      <w:r>
+        <w:rPr>
+          <w:rStyle w:val="10"/>
+        </w:rPr>
+        <w:t>How "done" looks for day 9:</w:t>
+      </w:r>
+      <w:r>
+        <w:t xml:space="preserve"> a CLI that takes no arguments (or minimal ones), builds the Silverstone segment list internally, runs the DP for qualifying mode and race mode, and prints something like a per-segment table showing battery level and deployment decision, plus total lap time — ideally alongside a naive baseline (e.g. "always deploy fully when possible") so the DP's improvement is visible and quantifiable. That comparison number (e.g. "DP-optimized qualifying lap is 0.3s faster than greedy") is genuinely good CV material — it's a concrete, explainable result.</w:t>
       </w:r>
     </w:p>
     <w:p>
@@ -3263,6 +3488,16 @@
     </w:tblPr>
   </w:style>
   <w:style w:type="character" w:styleId="6">
+    <w:name w:val="Emphasis"/>
+    <w:basedOn w:val="4"/>
+    <w:qFormat/>
+    <w:uiPriority w:val="0"/>
+    <w:rPr>
+      <w:i/>
+      <w:iCs/>
+    </w:rPr>
+  </w:style>
+  <w:style w:type="character" w:styleId="7">
     <w:name w:val="HTML Code"/>
     <w:basedOn w:val="4"/>
     <w:qFormat/>
@@ -3273,7 +3508,7 @@
       <w:szCs w:val="20"/>
     </w:rPr>
   </w:style>
-  <w:style w:type="paragraph" w:styleId="7">
+  <w:style w:type="paragraph" w:styleId="8">
     <w:name w:val="HTML Preformatted"/>
     <w:qFormat/>
     <w:uiPriority w:val="0"/>
@@ -3306,7 +3541,7 @@
       <w:lang w:val="en-US" w:eastAsia="zh-CN" w:bidi="ar"/>
     </w:rPr>
   </w:style>
-  <w:style w:type="paragraph" w:styleId="8">
+  <w:style w:type="paragraph" w:styleId="9">
     <w:name w:val="Normal (Web)"/>
     <w:qFormat/>
     <w:uiPriority w:val="0"/>
@@ -3323,7 +3558,7 @@
       <w:lang w:val="en-US" w:eastAsia="zh-CN" w:bidi="ar"/>
     </w:rPr>
   </w:style>
-  <w:style w:type="character" w:styleId="9">
+  <w:style w:type="character" w:styleId="10">
     <w:name w:val="Strong"/>
     <w:basedOn w:val="4"/>
     <w:qFormat/>
@@ -3333,7 +3568,7 @@
       <w:bCs/>
     </w:rPr>
   </w:style>
-  <w:style w:type="table" w:styleId="10">
+  <w:style w:type="table" w:styleId="11">
     <w:name w:val="Table Grid"/>
     <w:basedOn w:val="5"/>
     <w:qFormat/>

</xml_diff>

<commit_message>
Main changes is segment.cpp has some code now, reanalyzed how to represent the track, not complete yet
</commit_message>
<xml_diff>
--- a/structure and planning.docx
+++ b/structure and planning.docx
@@ -2980,8 +2980,6 @@
       <w:r>
         <w:t>Think of it as three layers, each testable independently:</w:t>
       </w:r>
-      <w:bookmarkStart w:id="0" w:name="_GoBack"/>
-      <w:bookmarkEnd w:id="0"/>
     </w:p>
     <w:p>
       <w:pPr>
@@ -3136,6 +3134,1123 @@
       </w:r>
       <w:r>
         <w:t xml:space="preserve"> a CLI that takes no arguments (or minimal ones), builds the Silverstone segment list internally, runs the DP for qualifying mode and race mode, and prints something like a per-segment table showing battery level and deployment decision, plus total lap time — ideally alongside a naive baseline (e.g. "always deploy fully when possible") so the DP's improvement is visible and quantifiable. That comparison number (e.g. "DP-optimized qualifying lap is 0.3s faster than greedy") is genuinely good CV material — it's a concrete, explainable result.</w:t>
+      </w:r>
+    </w:p>
+    <w:tbl>
+      <w:tblPr>
+        <w:tblStyle w:val="11"/>
+        <w:tblW w:w="0" w:type="auto"/>
+        <w:tblInd w:w="0" w:type="dxa"/>
+        <w:tblBorders>
+          <w:top w:val="single" w:color="auto" w:sz="4" w:space="0"/>
+          <w:left w:val="single" w:color="auto" w:sz="4" w:space="0"/>
+          <w:bottom w:val="single" w:color="auto" w:sz="4" w:space="0"/>
+          <w:right w:val="single" w:color="auto" w:sz="4" w:space="0"/>
+          <w:insideH w:val="single" w:color="auto" w:sz="4" w:space="0"/>
+          <w:insideV w:val="single" w:color="auto" w:sz="4" w:space="0"/>
+        </w:tblBorders>
+        <w:tblLayout w:type="autofit"/>
+        <w:tblCellMar>
+          <w:left w:w="108" w:type="dxa"/>
+          <w:right w:w="108" w:type="dxa"/>
+        </w:tblCellMar>
+      </w:tblPr>
+      <w:tblGrid>
+        <w:gridCol w:w="3560"/>
+        <w:gridCol w:w="3561"/>
+        <w:gridCol w:w="3561"/>
+      </w:tblGrid>
+      <w:tr>
+        <w:tblPrEx>
+          <w:tblBorders>
+            <w:top w:val="single" w:color="auto" w:sz="4" w:space="0"/>
+            <w:left w:val="single" w:color="auto" w:sz="4" w:space="0"/>
+            <w:bottom w:val="single" w:color="auto" w:sz="4" w:space="0"/>
+            <w:right w:val="single" w:color="auto" w:sz="4" w:space="0"/>
+            <w:insideH w:val="single" w:color="auto" w:sz="4" w:space="0"/>
+            <w:insideV w:val="single" w:color="auto" w:sz="4" w:space="0"/>
+          </w:tblBorders>
+          <w:tblCellMar>
+            <w:left w:w="108" w:type="dxa"/>
+            <w:right w:w="108" w:type="dxa"/>
+          </w:tblCellMar>
+        </w:tblPrEx>
+        <w:tc>
+          <w:tcPr>
+            <w:tcW w:w="3560" w:type="dxa"/>
+          </w:tcPr>
+          <w:p>
+            <w:pPr>
+              <w:spacing w:line="240" w:lineRule="auto"/>
+              <w:rPr>
+                <w:rFonts w:hint="default" w:ascii="Calibri" w:hAnsi="Calibri" w:cs="Calibri"/>
+                <w:sz w:val="22"/>
+                <w:szCs w:val="22"/>
+                <w:vertAlign w:val="baseline"/>
+              </w:rPr>
+            </w:pPr>
+          </w:p>
+        </w:tc>
+        <w:tc>
+          <w:tcPr>
+            <w:tcW w:w="3561" w:type="dxa"/>
+          </w:tcPr>
+          <w:p>
+            <w:pPr>
+              <w:spacing w:line="240" w:lineRule="auto"/>
+              <w:rPr>
+                <w:rFonts w:hint="default" w:ascii="Calibri" w:hAnsi="Calibri" w:cs="Calibri"/>
+                <w:sz w:val="22"/>
+                <w:szCs w:val="22"/>
+                <w:vertAlign w:val="baseline"/>
+              </w:rPr>
+            </w:pPr>
+          </w:p>
+        </w:tc>
+        <w:tc>
+          <w:tcPr>
+            <w:tcW w:w="3561" w:type="dxa"/>
+          </w:tcPr>
+          <w:p>
+            <w:pPr>
+              <w:spacing w:line="240" w:lineRule="auto"/>
+              <w:rPr>
+                <w:rFonts w:hint="default" w:ascii="Calibri" w:hAnsi="Calibri" w:cs="Calibri"/>
+                <w:sz w:val="22"/>
+                <w:szCs w:val="22"/>
+                <w:vertAlign w:val="baseline"/>
+              </w:rPr>
+            </w:pPr>
+          </w:p>
+        </w:tc>
+      </w:tr>
+      <w:tr>
+        <w:tblPrEx>
+          <w:tblBorders>
+            <w:top w:val="single" w:color="auto" w:sz="4" w:space="0"/>
+            <w:left w:val="single" w:color="auto" w:sz="4" w:space="0"/>
+            <w:bottom w:val="single" w:color="auto" w:sz="4" w:space="0"/>
+            <w:right w:val="single" w:color="auto" w:sz="4" w:space="0"/>
+            <w:insideH w:val="single" w:color="auto" w:sz="4" w:space="0"/>
+            <w:insideV w:val="single" w:color="auto" w:sz="4" w:space="0"/>
+          </w:tblBorders>
+          <w:tblCellMar>
+            <w:left w:w="108" w:type="dxa"/>
+            <w:right w:w="108" w:type="dxa"/>
+          </w:tblCellMar>
+        </w:tblPrEx>
+        <w:tc>
+          <w:tcPr>
+            <w:tcW w:w="3560" w:type="dxa"/>
+          </w:tcPr>
+          <w:p>
+            <w:pPr>
+              <w:spacing w:line="240" w:lineRule="auto"/>
+              <w:rPr>
+                <w:rFonts w:hint="default" w:ascii="Calibri" w:hAnsi="Calibri" w:cs="Calibri"/>
+                <w:sz w:val="22"/>
+                <w:szCs w:val="22"/>
+                <w:vertAlign w:val="baseline"/>
+              </w:rPr>
+            </w:pPr>
+          </w:p>
+        </w:tc>
+        <w:tc>
+          <w:tcPr>
+            <w:tcW w:w="3561" w:type="dxa"/>
+          </w:tcPr>
+          <w:p>
+            <w:pPr>
+              <w:spacing w:line="240" w:lineRule="auto"/>
+              <w:rPr>
+                <w:rFonts w:hint="default" w:ascii="Calibri" w:hAnsi="Calibri" w:cs="Calibri"/>
+                <w:sz w:val="22"/>
+                <w:szCs w:val="22"/>
+                <w:vertAlign w:val="baseline"/>
+              </w:rPr>
+            </w:pPr>
+          </w:p>
+        </w:tc>
+        <w:tc>
+          <w:tcPr>
+            <w:tcW w:w="3561" w:type="dxa"/>
+          </w:tcPr>
+          <w:p>
+            <w:pPr>
+              <w:spacing w:line="240" w:lineRule="auto"/>
+              <w:rPr>
+                <w:rFonts w:hint="default" w:ascii="Calibri" w:hAnsi="Calibri" w:cs="Calibri"/>
+                <w:sz w:val="22"/>
+                <w:szCs w:val="22"/>
+                <w:vertAlign w:val="baseline"/>
+              </w:rPr>
+            </w:pPr>
+          </w:p>
+        </w:tc>
+      </w:tr>
+      <w:tr>
+        <w:tblPrEx>
+          <w:tblBorders>
+            <w:top w:val="single" w:color="auto" w:sz="4" w:space="0"/>
+            <w:left w:val="single" w:color="auto" w:sz="4" w:space="0"/>
+            <w:bottom w:val="single" w:color="auto" w:sz="4" w:space="0"/>
+            <w:right w:val="single" w:color="auto" w:sz="4" w:space="0"/>
+            <w:insideH w:val="single" w:color="auto" w:sz="4" w:space="0"/>
+            <w:insideV w:val="single" w:color="auto" w:sz="4" w:space="0"/>
+          </w:tblBorders>
+          <w:tblCellMar>
+            <w:left w:w="108" w:type="dxa"/>
+            <w:right w:w="108" w:type="dxa"/>
+          </w:tblCellMar>
+        </w:tblPrEx>
+        <w:tc>
+          <w:tcPr>
+            <w:tcW w:w="3560" w:type="dxa"/>
+          </w:tcPr>
+          <w:p>
+            <w:pPr>
+              <w:spacing w:line="240" w:lineRule="auto"/>
+              <w:rPr>
+                <w:rFonts w:hint="default" w:ascii="Calibri" w:hAnsi="Calibri" w:cs="Calibri"/>
+                <w:sz w:val="22"/>
+                <w:szCs w:val="22"/>
+                <w:vertAlign w:val="baseline"/>
+              </w:rPr>
+            </w:pPr>
+          </w:p>
+        </w:tc>
+        <w:tc>
+          <w:tcPr>
+            <w:tcW w:w="3561" w:type="dxa"/>
+          </w:tcPr>
+          <w:p>
+            <w:pPr>
+              <w:spacing w:line="240" w:lineRule="auto"/>
+              <w:rPr>
+                <w:rFonts w:hint="default" w:ascii="Calibri" w:hAnsi="Calibri" w:cs="Calibri"/>
+                <w:sz w:val="22"/>
+                <w:szCs w:val="22"/>
+                <w:vertAlign w:val="baseline"/>
+              </w:rPr>
+            </w:pPr>
+          </w:p>
+        </w:tc>
+        <w:tc>
+          <w:tcPr>
+            <w:tcW w:w="3561" w:type="dxa"/>
+          </w:tcPr>
+          <w:p>
+            <w:pPr>
+              <w:spacing w:line="240" w:lineRule="auto"/>
+              <w:rPr>
+                <w:rFonts w:hint="default" w:ascii="Calibri" w:hAnsi="Calibri" w:cs="Calibri"/>
+                <w:sz w:val="22"/>
+                <w:szCs w:val="22"/>
+                <w:vertAlign w:val="baseline"/>
+              </w:rPr>
+            </w:pPr>
+          </w:p>
+        </w:tc>
+      </w:tr>
+      <w:tr>
+        <w:tblPrEx>
+          <w:tblBorders>
+            <w:top w:val="single" w:color="auto" w:sz="4" w:space="0"/>
+            <w:left w:val="single" w:color="auto" w:sz="4" w:space="0"/>
+            <w:bottom w:val="single" w:color="auto" w:sz="4" w:space="0"/>
+            <w:right w:val="single" w:color="auto" w:sz="4" w:space="0"/>
+            <w:insideH w:val="single" w:color="auto" w:sz="4" w:space="0"/>
+            <w:insideV w:val="single" w:color="auto" w:sz="4" w:space="0"/>
+          </w:tblBorders>
+          <w:tblCellMar>
+            <w:left w:w="108" w:type="dxa"/>
+            <w:right w:w="108" w:type="dxa"/>
+          </w:tblCellMar>
+        </w:tblPrEx>
+        <w:tc>
+          <w:tcPr>
+            <w:tcW w:w="3560" w:type="dxa"/>
+          </w:tcPr>
+          <w:p>
+            <w:pPr>
+              <w:spacing w:line="240" w:lineRule="auto"/>
+              <w:rPr>
+                <w:rFonts w:hint="default" w:ascii="Calibri" w:hAnsi="Calibri" w:cs="Calibri"/>
+                <w:sz w:val="22"/>
+                <w:szCs w:val="22"/>
+                <w:vertAlign w:val="baseline"/>
+              </w:rPr>
+            </w:pPr>
+          </w:p>
+        </w:tc>
+        <w:tc>
+          <w:tcPr>
+            <w:tcW w:w="3561" w:type="dxa"/>
+          </w:tcPr>
+          <w:p>
+            <w:pPr>
+              <w:spacing w:line="240" w:lineRule="auto"/>
+              <w:rPr>
+                <w:rFonts w:hint="default" w:ascii="Calibri" w:hAnsi="Calibri" w:cs="Calibri"/>
+                <w:sz w:val="22"/>
+                <w:szCs w:val="22"/>
+                <w:vertAlign w:val="baseline"/>
+              </w:rPr>
+            </w:pPr>
+          </w:p>
+        </w:tc>
+        <w:tc>
+          <w:tcPr>
+            <w:tcW w:w="3561" w:type="dxa"/>
+          </w:tcPr>
+          <w:p>
+            <w:pPr>
+              <w:spacing w:line="240" w:lineRule="auto"/>
+              <w:rPr>
+                <w:rFonts w:hint="default" w:ascii="Calibri" w:hAnsi="Calibri" w:cs="Calibri"/>
+                <w:sz w:val="22"/>
+                <w:szCs w:val="22"/>
+                <w:vertAlign w:val="baseline"/>
+              </w:rPr>
+            </w:pPr>
+          </w:p>
+        </w:tc>
+      </w:tr>
+      <w:tr>
+        <w:tblPrEx>
+          <w:tblBorders>
+            <w:top w:val="single" w:color="auto" w:sz="4" w:space="0"/>
+            <w:left w:val="single" w:color="auto" w:sz="4" w:space="0"/>
+            <w:bottom w:val="single" w:color="auto" w:sz="4" w:space="0"/>
+            <w:right w:val="single" w:color="auto" w:sz="4" w:space="0"/>
+            <w:insideH w:val="single" w:color="auto" w:sz="4" w:space="0"/>
+            <w:insideV w:val="single" w:color="auto" w:sz="4" w:space="0"/>
+          </w:tblBorders>
+          <w:tblCellMar>
+            <w:left w:w="108" w:type="dxa"/>
+            <w:right w:w="108" w:type="dxa"/>
+          </w:tblCellMar>
+        </w:tblPrEx>
+        <w:tc>
+          <w:tcPr>
+            <w:tcW w:w="3560" w:type="dxa"/>
+          </w:tcPr>
+          <w:p>
+            <w:pPr>
+              <w:spacing w:line="240" w:lineRule="auto"/>
+              <w:rPr>
+                <w:rFonts w:hint="default" w:ascii="Calibri" w:hAnsi="Calibri" w:cs="Calibri"/>
+                <w:sz w:val="22"/>
+                <w:szCs w:val="22"/>
+                <w:vertAlign w:val="baseline"/>
+              </w:rPr>
+            </w:pPr>
+          </w:p>
+        </w:tc>
+        <w:tc>
+          <w:tcPr>
+            <w:tcW w:w="3561" w:type="dxa"/>
+          </w:tcPr>
+          <w:p>
+            <w:pPr>
+              <w:spacing w:line="240" w:lineRule="auto"/>
+              <w:rPr>
+                <w:rFonts w:hint="default" w:ascii="Calibri" w:hAnsi="Calibri" w:cs="Calibri"/>
+                <w:sz w:val="22"/>
+                <w:szCs w:val="22"/>
+                <w:vertAlign w:val="baseline"/>
+              </w:rPr>
+            </w:pPr>
+          </w:p>
+        </w:tc>
+        <w:tc>
+          <w:tcPr>
+            <w:tcW w:w="3561" w:type="dxa"/>
+          </w:tcPr>
+          <w:p>
+            <w:pPr>
+              <w:spacing w:line="240" w:lineRule="auto"/>
+              <w:rPr>
+                <w:rFonts w:hint="default" w:ascii="Calibri" w:hAnsi="Calibri" w:cs="Calibri"/>
+                <w:sz w:val="22"/>
+                <w:szCs w:val="22"/>
+                <w:vertAlign w:val="baseline"/>
+              </w:rPr>
+            </w:pPr>
+          </w:p>
+        </w:tc>
+      </w:tr>
+      <w:tr>
+        <w:tblPrEx>
+          <w:tblBorders>
+            <w:top w:val="single" w:color="auto" w:sz="4" w:space="0"/>
+            <w:left w:val="single" w:color="auto" w:sz="4" w:space="0"/>
+            <w:bottom w:val="single" w:color="auto" w:sz="4" w:space="0"/>
+            <w:right w:val="single" w:color="auto" w:sz="4" w:space="0"/>
+            <w:insideH w:val="single" w:color="auto" w:sz="4" w:space="0"/>
+            <w:insideV w:val="single" w:color="auto" w:sz="4" w:space="0"/>
+          </w:tblBorders>
+          <w:tblCellMar>
+            <w:left w:w="108" w:type="dxa"/>
+            <w:right w:w="108" w:type="dxa"/>
+          </w:tblCellMar>
+        </w:tblPrEx>
+        <w:tc>
+          <w:tcPr>
+            <w:tcW w:w="3560" w:type="dxa"/>
+          </w:tcPr>
+          <w:p>
+            <w:pPr>
+              <w:spacing w:line="240" w:lineRule="auto"/>
+              <w:rPr>
+                <w:rFonts w:hint="default" w:ascii="Calibri" w:hAnsi="Calibri" w:cs="Calibri"/>
+                <w:sz w:val="22"/>
+                <w:szCs w:val="22"/>
+                <w:vertAlign w:val="baseline"/>
+              </w:rPr>
+            </w:pPr>
+          </w:p>
+        </w:tc>
+        <w:tc>
+          <w:tcPr>
+            <w:tcW w:w="3561" w:type="dxa"/>
+          </w:tcPr>
+          <w:p>
+            <w:pPr>
+              <w:spacing w:line="240" w:lineRule="auto"/>
+              <w:rPr>
+                <w:rFonts w:hint="default" w:ascii="Calibri" w:hAnsi="Calibri" w:cs="Calibri"/>
+                <w:sz w:val="22"/>
+                <w:szCs w:val="22"/>
+                <w:vertAlign w:val="baseline"/>
+              </w:rPr>
+            </w:pPr>
+          </w:p>
+        </w:tc>
+        <w:tc>
+          <w:tcPr>
+            <w:tcW w:w="3561" w:type="dxa"/>
+          </w:tcPr>
+          <w:p>
+            <w:pPr>
+              <w:spacing w:line="240" w:lineRule="auto"/>
+              <w:rPr>
+                <w:rFonts w:hint="default" w:ascii="Calibri" w:hAnsi="Calibri" w:cs="Calibri"/>
+                <w:sz w:val="22"/>
+                <w:szCs w:val="22"/>
+                <w:vertAlign w:val="baseline"/>
+              </w:rPr>
+            </w:pPr>
+          </w:p>
+        </w:tc>
+      </w:tr>
+      <w:tr>
+        <w:tblPrEx>
+          <w:tblBorders>
+            <w:top w:val="single" w:color="auto" w:sz="4" w:space="0"/>
+            <w:left w:val="single" w:color="auto" w:sz="4" w:space="0"/>
+            <w:bottom w:val="single" w:color="auto" w:sz="4" w:space="0"/>
+            <w:right w:val="single" w:color="auto" w:sz="4" w:space="0"/>
+            <w:insideH w:val="single" w:color="auto" w:sz="4" w:space="0"/>
+            <w:insideV w:val="single" w:color="auto" w:sz="4" w:space="0"/>
+          </w:tblBorders>
+          <w:tblCellMar>
+            <w:left w:w="108" w:type="dxa"/>
+            <w:right w:w="108" w:type="dxa"/>
+          </w:tblCellMar>
+        </w:tblPrEx>
+        <w:tc>
+          <w:tcPr>
+            <w:tcW w:w="3560" w:type="dxa"/>
+          </w:tcPr>
+          <w:p>
+            <w:pPr>
+              <w:spacing w:line="240" w:lineRule="auto"/>
+              <w:rPr>
+                <w:rFonts w:hint="default" w:ascii="Calibri" w:hAnsi="Calibri" w:cs="Calibri"/>
+                <w:sz w:val="22"/>
+                <w:szCs w:val="22"/>
+                <w:vertAlign w:val="baseline"/>
+              </w:rPr>
+            </w:pPr>
+          </w:p>
+        </w:tc>
+        <w:tc>
+          <w:tcPr>
+            <w:tcW w:w="3561" w:type="dxa"/>
+          </w:tcPr>
+          <w:p>
+            <w:pPr>
+              <w:spacing w:line="240" w:lineRule="auto"/>
+              <w:rPr>
+                <w:rFonts w:hint="default" w:ascii="Calibri" w:hAnsi="Calibri" w:cs="Calibri"/>
+                <w:sz w:val="22"/>
+                <w:szCs w:val="22"/>
+                <w:vertAlign w:val="baseline"/>
+              </w:rPr>
+            </w:pPr>
+          </w:p>
+        </w:tc>
+        <w:tc>
+          <w:tcPr>
+            <w:tcW w:w="3561" w:type="dxa"/>
+          </w:tcPr>
+          <w:p>
+            <w:pPr>
+              <w:spacing w:line="240" w:lineRule="auto"/>
+              <w:rPr>
+                <w:rFonts w:hint="default" w:ascii="Calibri" w:hAnsi="Calibri" w:cs="Calibri"/>
+                <w:sz w:val="22"/>
+                <w:szCs w:val="22"/>
+                <w:vertAlign w:val="baseline"/>
+              </w:rPr>
+            </w:pPr>
+          </w:p>
+        </w:tc>
+      </w:tr>
+      <w:tr>
+        <w:tblPrEx>
+          <w:tblBorders>
+            <w:top w:val="single" w:color="auto" w:sz="4" w:space="0"/>
+            <w:left w:val="single" w:color="auto" w:sz="4" w:space="0"/>
+            <w:bottom w:val="single" w:color="auto" w:sz="4" w:space="0"/>
+            <w:right w:val="single" w:color="auto" w:sz="4" w:space="0"/>
+            <w:insideH w:val="single" w:color="auto" w:sz="4" w:space="0"/>
+            <w:insideV w:val="single" w:color="auto" w:sz="4" w:space="0"/>
+          </w:tblBorders>
+          <w:tblCellMar>
+            <w:left w:w="108" w:type="dxa"/>
+            <w:right w:w="108" w:type="dxa"/>
+          </w:tblCellMar>
+        </w:tblPrEx>
+        <w:tc>
+          <w:tcPr>
+            <w:tcW w:w="3560" w:type="dxa"/>
+          </w:tcPr>
+          <w:p>
+            <w:pPr>
+              <w:spacing w:line="240" w:lineRule="auto"/>
+              <w:rPr>
+                <w:rFonts w:hint="default" w:ascii="Calibri" w:hAnsi="Calibri" w:cs="Calibri"/>
+                <w:sz w:val="22"/>
+                <w:szCs w:val="22"/>
+                <w:vertAlign w:val="baseline"/>
+              </w:rPr>
+            </w:pPr>
+          </w:p>
+        </w:tc>
+        <w:tc>
+          <w:tcPr>
+            <w:tcW w:w="3561" w:type="dxa"/>
+          </w:tcPr>
+          <w:p>
+            <w:pPr>
+              <w:spacing w:line="240" w:lineRule="auto"/>
+              <w:rPr>
+                <w:rFonts w:hint="default" w:ascii="Calibri" w:hAnsi="Calibri" w:cs="Calibri"/>
+                <w:sz w:val="22"/>
+                <w:szCs w:val="22"/>
+                <w:vertAlign w:val="baseline"/>
+              </w:rPr>
+            </w:pPr>
+          </w:p>
+        </w:tc>
+        <w:tc>
+          <w:tcPr>
+            <w:tcW w:w="3561" w:type="dxa"/>
+          </w:tcPr>
+          <w:p>
+            <w:pPr>
+              <w:spacing w:line="240" w:lineRule="auto"/>
+              <w:rPr>
+                <w:rFonts w:hint="default" w:ascii="Calibri" w:hAnsi="Calibri" w:cs="Calibri"/>
+                <w:sz w:val="22"/>
+                <w:szCs w:val="22"/>
+                <w:vertAlign w:val="baseline"/>
+              </w:rPr>
+            </w:pPr>
+          </w:p>
+        </w:tc>
+      </w:tr>
+    </w:tbl>
+    <w:p>
+      <w:pPr>
+        <w:keepNext w:val="0"/>
+        <w:keepLines w:val="0"/>
+        <w:widowControl/>
+        <w:suppressLineNumbers w:val="0"/>
+        <w:shd w:val="clear" w:fill="F5F5F5"/>
+        <w:spacing w:line="190" w:lineRule="atLeast"/>
+        <w:jc w:val="left"/>
+        <w:rPr>
+          <w:rFonts w:hint="default" w:eastAsia="Consolas" w:cs="Consolas" w:asciiTheme="minorAscii" w:hAnsiTheme="minorAscii"/>
+          <w:b w:val="0"/>
+          <w:bCs w:val="0"/>
+          <w:color w:val="333333"/>
+          <w:sz w:val="22"/>
+          <w:szCs w:val="22"/>
+          <w:shd w:val="clear" w:color="auto" w:fill="auto"/>
+        </w:rPr>
+      </w:pPr>
+      <w:r>
+        <w:rPr>
+          <w:rFonts w:hint="default" w:eastAsia="Consolas" w:cs="Consolas" w:asciiTheme="minorAscii" w:hAnsiTheme="minorAscii"/>
+          <w:b w:val="0"/>
+          <w:bCs w:val="0"/>
+          <w:color w:val="333333"/>
+          <w:kern w:val="0"/>
+          <w:sz w:val="22"/>
+          <w:szCs w:val="22"/>
+          <w:shd w:val="clear" w:color="auto" w:fill="auto"/>
+          <w:lang w:val="en-US" w:eastAsia="zh-CN" w:bidi="ar"/>
+        </w:rPr>
+        <w:t>Segment Type Character</w:t>
+      </w:r>
+    </w:p>
+    <w:p>
+      <w:pPr>
+        <w:keepNext w:val="0"/>
+        <w:keepLines w:val="0"/>
+        <w:widowControl/>
+        <w:suppressLineNumbers w:val="0"/>
+        <w:shd w:val="clear" w:fill="F5F5F5"/>
+        <w:spacing w:line="190" w:lineRule="atLeast"/>
+        <w:jc w:val="left"/>
+        <w:rPr>
+          <w:rFonts w:hint="default" w:eastAsia="Consolas" w:cs="Consolas" w:asciiTheme="minorAscii" w:hAnsiTheme="minorAscii"/>
+          <w:b w:val="0"/>
+          <w:bCs w:val="0"/>
+          <w:color w:val="333333"/>
+          <w:sz w:val="22"/>
+          <w:szCs w:val="22"/>
+          <w:shd w:val="clear" w:color="auto" w:fill="auto"/>
+        </w:rPr>
+      </w:pPr>
+      <w:r>
+        <w:rPr>
+          <w:rFonts w:hint="default" w:eastAsia="Consolas" w:cs="Consolas" w:asciiTheme="minorAscii" w:hAnsiTheme="minorAscii"/>
+          <w:b w:val="0"/>
+          <w:bCs w:val="0"/>
+          <w:color w:val="333333"/>
+          <w:kern w:val="0"/>
+          <w:sz w:val="22"/>
+          <w:szCs w:val="22"/>
+          <w:shd w:val="clear" w:color="auto" w:fill="auto"/>
+          <w:lang w:val="en-US" w:eastAsia="zh-CN" w:bidi="ar"/>
+        </w:rPr>
+        <w:t>Hamilton Straight   straight        full throttle, into Abbey</w:t>
+      </w:r>
+    </w:p>
+    <w:p>
+      <w:pPr>
+        <w:keepNext w:val="0"/>
+        <w:keepLines w:val="0"/>
+        <w:widowControl/>
+        <w:suppressLineNumbers w:val="0"/>
+        <w:shd w:val="clear" w:fill="F5F5F5"/>
+        <w:spacing w:line="190" w:lineRule="atLeast"/>
+        <w:jc w:val="left"/>
+        <w:rPr>
+          <w:rFonts w:hint="default" w:eastAsia="Consolas" w:cs="Consolas" w:asciiTheme="minorAscii" w:hAnsiTheme="minorAscii"/>
+          <w:b w:val="0"/>
+          <w:bCs w:val="0"/>
+          <w:color w:val="333333"/>
+          <w:sz w:val="22"/>
+          <w:szCs w:val="22"/>
+          <w:shd w:val="clear" w:color="auto" w:fill="auto"/>
+        </w:rPr>
+      </w:pPr>
+      <w:r>
+        <w:rPr>
+          <w:rFonts w:hint="default" w:eastAsia="Consolas" w:cs="Consolas" w:asciiTheme="minorAscii" w:hAnsiTheme="minorAscii"/>
+          <w:b w:val="0"/>
+          <w:bCs w:val="0"/>
+          <w:color w:val="333333"/>
+          <w:kern w:val="0"/>
+          <w:sz w:val="22"/>
+          <w:szCs w:val="22"/>
+          <w:shd w:val="clear" w:color="auto" w:fill="auto"/>
+          <w:lang w:val="en-US" w:eastAsia="zh-CN" w:bidi="ar"/>
+        </w:rPr>
+        <w:t>Abbey (T1)          high-speed      corner~280km/h, barely lifts</w:t>
+      </w:r>
+    </w:p>
+    <w:p>
+      <w:pPr>
+        <w:keepNext w:val="0"/>
+        <w:keepLines w:val="0"/>
+        <w:widowControl/>
+        <w:suppressLineNumbers w:val="0"/>
+        <w:shd w:val="clear" w:fill="F5F5F5"/>
+        <w:spacing w:line="190" w:lineRule="atLeast"/>
+        <w:jc w:val="left"/>
+        <w:rPr>
+          <w:rFonts w:hint="default" w:eastAsia="Consolas" w:cs="Consolas" w:asciiTheme="minorAscii" w:hAnsiTheme="minorAscii"/>
+          <w:b w:val="0"/>
+          <w:bCs w:val="0"/>
+          <w:color w:val="333333"/>
+          <w:sz w:val="22"/>
+          <w:szCs w:val="22"/>
+          <w:shd w:val="clear" w:color="auto" w:fill="auto"/>
+        </w:rPr>
+      </w:pPr>
+      <w:r>
+        <w:rPr>
+          <w:rFonts w:hint="default" w:eastAsia="Consolas" w:cs="Consolas" w:asciiTheme="minorAscii" w:hAnsiTheme="minorAscii"/>
+          <w:b w:val="0"/>
+          <w:bCs w:val="0"/>
+          <w:color w:val="333333"/>
+          <w:kern w:val="0"/>
+          <w:sz w:val="22"/>
+          <w:szCs w:val="22"/>
+          <w:shd w:val="clear" w:color="auto" w:fill="auto"/>
+          <w:lang w:val="en-US" w:eastAsia="zh-CN" w:bidi="ar"/>
+        </w:rPr>
+        <w:t>Farm (T2)           high-speed      kink fast, minimal lift</w:t>
+      </w:r>
+    </w:p>
+    <w:p>
+      <w:pPr>
+        <w:keepNext w:val="0"/>
+        <w:keepLines w:val="0"/>
+        <w:widowControl/>
+        <w:suppressLineNumbers w:val="0"/>
+        <w:shd w:val="clear" w:fill="F5F5F5"/>
+        <w:spacing w:line="190" w:lineRule="atLeast"/>
+        <w:jc w:val="left"/>
+        <w:rPr>
+          <w:rFonts w:hint="default" w:eastAsia="Consolas" w:cs="Consolas" w:asciiTheme="minorAscii" w:hAnsiTheme="minorAscii"/>
+          <w:b w:val="0"/>
+          <w:bCs w:val="0"/>
+          <w:color w:val="333333"/>
+          <w:sz w:val="22"/>
+          <w:szCs w:val="22"/>
+          <w:shd w:val="clear" w:color="auto" w:fill="auto"/>
+        </w:rPr>
+      </w:pPr>
+      <w:r>
+        <w:rPr>
+          <w:rFonts w:hint="default" w:eastAsia="Consolas" w:cs="Consolas" w:asciiTheme="minorAscii" w:hAnsiTheme="minorAscii"/>
+          <w:b w:val="0"/>
+          <w:bCs w:val="0"/>
+          <w:color w:val="333333"/>
+          <w:kern w:val="0"/>
+          <w:sz w:val="22"/>
+          <w:szCs w:val="22"/>
+          <w:shd w:val="clear" w:color="auto" w:fill="auto"/>
+          <w:lang w:val="en-US" w:eastAsia="zh-CN" w:bidi="ar"/>
+        </w:rPr>
+        <w:t>Village (T3)        corner          first real braking zone</w:t>
+      </w:r>
+    </w:p>
+    <w:p>
+      <w:pPr>
+        <w:keepNext w:val="0"/>
+        <w:keepLines w:val="0"/>
+        <w:widowControl/>
+        <w:suppressLineNumbers w:val="0"/>
+        <w:shd w:val="clear" w:fill="F5F5F5"/>
+        <w:spacing w:line="190" w:lineRule="atLeast"/>
+        <w:jc w:val="left"/>
+        <w:rPr>
+          <w:rFonts w:hint="default" w:eastAsia="Consolas" w:cs="Consolas" w:asciiTheme="minorAscii" w:hAnsiTheme="minorAscii"/>
+          <w:b w:val="0"/>
+          <w:bCs w:val="0"/>
+          <w:color w:val="333333"/>
+          <w:sz w:val="22"/>
+          <w:szCs w:val="22"/>
+          <w:shd w:val="clear" w:color="auto" w:fill="auto"/>
+        </w:rPr>
+      </w:pPr>
+      <w:r>
+        <w:rPr>
+          <w:rFonts w:hint="default" w:eastAsia="Consolas" w:cs="Consolas" w:asciiTheme="minorAscii" w:hAnsiTheme="minorAscii"/>
+          <w:b w:val="0"/>
+          <w:bCs w:val="0"/>
+          <w:color w:val="333333"/>
+          <w:kern w:val="0"/>
+          <w:sz w:val="22"/>
+          <w:szCs w:val="22"/>
+          <w:shd w:val="clear" w:color="auto" w:fill="auto"/>
+          <w:lang w:val="en-US" w:eastAsia="zh-CN" w:bidi="ar"/>
+        </w:rPr>
+        <w:t>The Loop (T4)       hairpin         slowest corner on track — heavy braking</w:t>
+      </w:r>
+    </w:p>
+    <w:p>
+      <w:pPr>
+        <w:keepNext w:val="0"/>
+        <w:keepLines w:val="0"/>
+        <w:widowControl/>
+        <w:suppressLineNumbers w:val="0"/>
+        <w:shd w:val="clear" w:fill="F5F5F5"/>
+        <w:spacing w:line="190" w:lineRule="atLeast"/>
+        <w:jc w:val="left"/>
+        <w:rPr>
+          <w:rFonts w:hint="default" w:eastAsia="Consolas" w:cs="Consolas" w:asciiTheme="minorAscii" w:hAnsiTheme="minorAscii"/>
+          <w:b w:val="0"/>
+          <w:bCs w:val="0"/>
+          <w:color w:val="333333"/>
+          <w:sz w:val="22"/>
+          <w:szCs w:val="22"/>
+          <w:shd w:val="clear" w:color="auto" w:fill="auto"/>
+        </w:rPr>
+      </w:pPr>
+      <w:r>
+        <w:rPr>
+          <w:rFonts w:hint="default" w:eastAsia="Consolas" w:cs="Consolas" w:asciiTheme="minorAscii" w:hAnsiTheme="minorAscii"/>
+          <w:b w:val="0"/>
+          <w:bCs w:val="0"/>
+          <w:color w:val="333333"/>
+          <w:kern w:val="0"/>
+          <w:sz w:val="22"/>
+          <w:szCs w:val="22"/>
+          <w:shd w:val="clear" w:color="auto" w:fill="auto"/>
+          <w:lang w:val="en-US" w:eastAsia="zh-CN" w:bidi="ar"/>
+        </w:rPr>
+        <w:t>Aintree (T5)        corner          medium speed</w:t>
+      </w:r>
+    </w:p>
+    <w:p>
+      <w:pPr>
+        <w:keepNext w:val="0"/>
+        <w:keepLines w:val="0"/>
+        <w:widowControl/>
+        <w:suppressLineNumbers w:val="0"/>
+        <w:shd w:val="clear" w:fill="F5F5F5"/>
+        <w:spacing w:line="190" w:lineRule="atLeast"/>
+        <w:jc w:val="left"/>
+        <w:rPr>
+          <w:rFonts w:hint="default" w:eastAsia="Consolas" w:cs="Consolas" w:asciiTheme="minorAscii" w:hAnsiTheme="minorAscii"/>
+          <w:b w:val="0"/>
+          <w:bCs w:val="0"/>
+          <w:color w:val="333333"/>
+          <w:sz w:val="22"/>
+          <w:szCs w:val="22"/>
+          <w:shd w:val="clear" w:color="auto" w:fill="auto"/>
+        </w:rPr>
+      </w:pPr>
+      <w:r>
+        <w:rPr>
+          <w:rFonts w:hint="default" w:eastAsia="Consolas" w:cs="Consolas" w:asciiTheme="minorAscii" w:hAnsiTheme="minorAscii"/>
+          <w:b w:val="0"/>
+          <w:bCs w:val="0"/>
+          <w:color w:val="333333"/>
+          <w:kern w:val="0"/>
+          <w:sz w:val="22"/>
+          <w:szCs w:val="22"/>
+          <w:shd w:val="clear" w:color="auto" w:fill="auto"/>
+          <w:lang w:val="en-US" w:eastAsia="zh-CN" w:bidi="ar"/>
+        </w:rPr>
+        <w:t>Wellington Straight straight        acceleration zone</w:t>
+      </w:r>
+    </w:p>
+    <w:p>
+      <w:pPr>
+        <w:keepNext w:val="0"/>
+        <w:keepLines w:val="0"/>
+        <w:widowControl/>
+        <w:suppressLineNumbers w:val="0"/>
+        <w:shd w:val="clear" w:fill="F5F5F5"/>
+        <w:spacing w:line="190" w:lineRule="atLeast"/>
+        <w:jc w:val="left"/>
+        <w:rPr>
+          <w:rFonts w:hint="default" w:eastAsia="Consolas" w:cs="Consolas" w:asciiTheme="minorAscii" w:hAnsiTheme="minorAscii"/>
+          <w:b w:val="0"/>
+          <w:bCs w:val="0"/>
+          <w:color w:val="333333"/>
+          <w:sz w:val="22"/>
+          <w:szCs w:val="22"/>
+          <w:shd w:val="clear" w:color="auto" w:fill="auto"/>
+        </w:rPr>
+      </w:pPr>
+      <w:r>
+        <w:rPr>
+          <w:rFonts w:hint="default" w:eastAsia="Consolas" w:cs="Consolas" w:asciiTheme="minorAscii" w:hAnsiTheme="minorAscii"/>
+          <w:b w:val="0"/>
+          <w:bCs w:val="0"/>
+          <w:color w:val="333333"/>
+          <w:kern w:val="0"/>
+          <w:sz w:val="22"/>
+          <w:szCs w:val="22"/>
+          <w:shd w:val="clear" w:color="auto" w:fill="auto"/>
+          <w:lang w:val="en-US" w:eastAsia="zh-CN" w:bidi="ar"/>
+        </w:rPr>
+        <w:t>Brooklands (T6)     corner medium-heavy braking</w:t>
+      </w:r>
+    </w:p>
+    <w:p>
+      <w:pPr>
+        <w:keepNext w:val="0"/>
+        <w:keepLines w:val="0"/>
+        <w:widowControl/>
+        <w:suppressLineNumbers w:val="0"/>
+        <w:shd w:val="clear" w:fill="F5F5F5"/>
+        <w:spacing w:line="190" w:lineRule="atLeast"/>
+        <w:jc w:val="left"/>
+        <w:rPr>
+          <w:rFonts w:hint="default" w:eastAsia="Consolas" w:cs="Consolas" w:asciiTheme="minorAscii" w:hAnsiTheme="minorAscii"/>
+          <w:b w:val="0"/>
+          <w:bCs w:val="0"/>
+          <w:color w:val="333333"/>
+          <w:sz w:val="22"/>
+          <w:szCs w:val="22"/>
+          <w:shd w:val="clear" w:color="auto" w:fill="auto"/>
+        </w:rPr>
+      </w:pPr>
+      <w:r>
+        <w:rPr>
+          <w:rFonts w:hint="default" w:eastAsia="Consolas" w:cs="Consolas" w:asciiTheme="minorAscii" w:hAnsiTheme="minorAscii"/>
+          <w:b w:val="0"/>
+          <w:bCs w:val="0"/>
+          <w:color w:val="333333"/>
+          <w:kern w:val="0"/>
+          <w:sz w:val="22"/>
+          <w:szCs w:val="22"/>
+          <w:shd w:val="clear" w:color="auto" w:fill="auto"/>
+          <w:lang w:val="en-US" w:eastAsia="zh-CN" w:bidi="ar"/>
+        </w:rPr>
+        <w:t>Luffield (T7)       corner tightens, low-medium speed</w:t>
+      </w:r>
+    </w:p>
+    <w:p>
+      <w:pPr>
+        <w:keepNext w:val="0"/>
+        <w:keepLines w:val="0"/>
+        <w:widowControl/>
+        <w:suppressLineNumbers w:val="0"/>
+        <w:shd w:val="clear" w:fill="F5F5F5"/>
+        <w:spacing w:line="190" w:lineRule="atLeast"/>
+        <w:jc w:val="left"/>
+        <w:rPr>
+          <w:rFonts w:hint="default" w:eastAsia="Consolas" w:cs="Consolas" w:asciiTheme="minorAscii" w:hAnsiTheme="minorAscii"/>
+          <w:b w:val="0"/>
+          <w:bCs w:val="0"/>
+          <w:color w:val="333333"/>
+          <w:sz w:val="22"/>
+          <w:szCs w:val="22"/>
+          <w:shd w:val="clear" w:color="auto" w:fill="auto"/>
+        </w:rPr>
+      </w:pPr>
+      <w:r>
+        <w:rPr>
+          <w:rFonts w:hint="default" w:eastAsia="Consolas" w:cs="Consolas" w:asciiTheme="minorAscii" w:hAnsiTheme="minorAscii"/>
+          <w:b w:val="0"/>
+          <w:bCs w:val="0"/>
+          <w:color w:val="333333"/>
+          <w:kern w:val="0"/>
+          <w:sz w:val="22"/>
+          <w:szCs w:val="22"/>
+          <w:shd w:val="clear" w:color="auto" w:fill="auto"/>
+          <w:lang w:val="en-US" w:eastAsia="zh-CN" w:bidi="ar"/>
+        </w:rPr>
+        <w:t>Woodcote (T8)       corner leads onto next straight</w:t>
+      </w:r>
+    </w:p>
+    <w:p>
+      <w:pPr>
+        <w:keepNext w:val="0"/>
+        <w:keepLines w:val="0"/>
+        <w:widowControl/>
+        <w:suppressLineNumbers w:val="0"/>
+        <w:shd w:val="clear" w:fill="F5F5F5"/>
+        <w:spacing w:line="190" w:lineRule="atLeast"/>
+        <w:jc w:val="left"/>
+        <w:rPr>
+          <w:rFonts w:hint="default" w:eastAsia="Consolas" w:cs="Consolas" w:asciiTheme="minorAscii" w:hAnsiTheme="minorAscii"/>
+          <w:b w:val="0"/>
+          <w:bCs w:val="0"/>
+          <w:color w:val="333333"/>
+          <w:sz w:val="22"/>
+          <w:szCs w:val="22"/>
+          <w:shd w:val="clear" w:color="auto" w:fill="auto"/>
+        </w:rPr>
+      </w:pPr>
+      <w:r>
+        <w:rPr>
+          <w:rFonts w:hint="default" w:eastAsia="Consolas" w:cs="Consolas" w:asciiTheme="minorAscii" w:hAnsiTheme="minorAscii"/>
+          <w:b w:val="0"/>
+          <w:bCs w:val="0"/>
+          <w:color w:val="333333"/>
+          <w:kern w:val="0"/>
+          <w:sz w:val="22"/>
+          <w:szCs w:val="22"/>
+          <w:shd w:val="clear" w:color="auto" w:fill="auto"/>
+          <w:lang w:val="en-US" w:eastAsia="zh-CN" w:bidi="ar"/>
+        </w:rPr>
+        <w:t>Copse (T9)          high-speed corner  ~290km/h+, minimal braking</w:t>
+      </w:r>
+    </w:p>
+    <w:p>
+      <w:pPr>
+        <w:keepNext w:val="0"/>
+        <w:keepLines w:val="0"/>
+        <w:widowControl/>
+        <w:suppressLineNumbers w:val="0"/>
+        <w:shd w:val="clear" w:fill="F5F5F5"/>
+        <w:spacing w:line="190" w:lineRule="atLeast"/>
+        <w:jc w:val="left"/>
+        <w:rPr>
+          <w:rFonts w:hint="default" w:eastAsia="Consolas" w:cs="Consolas" w:asciiTheme="minorAscii" w:hAnsiTheme="minorAscii"/>
+          <w:b w:val="0"/>
+          <w:bCs w:val="0"/>
+          <w:color w:val="333333"/>
+          <w:sz w:val="22"/>
+          <w:szCs w:val="22"/>
+          <w:shd w:val="clear" w:color="auto" w:fill="auto"/>
+        </w:rPr>
+      </w:pPr>
+      <w:r>
+        <w:rPr>
+          <w:rFonts w:hint="default" w:eastAsia="Consolas" w:cs="Consolas" w:asciiTheme="minorAscii" w:hAnsiTheme="minorAscii"/>
+          <w:b w:val="0"/>
+          <w:bCs w:val="0"/>
+          <w:color w:val="333333"/>
+          <w:kern w:val="0"/>
+          <w:sz w:val="22"/>
+          <w:szCs w:val="22"/>
+          <w:shd w:val="clear" w:color="auto" w:fill="auto"/>
+          <w:lang w:val="en-US" w:eastAsia="zh-CN" w:bidi="ar"/>
+        </w:rPr>
+        <w:t>Maggotts–Becketts–Chapel (T10–14)high-speed esses  ~300km/h sequence, near-flat</w:t>
+      </w:r>
+      <w:bookmarkStart w:id="0" w:name="_GoBack"/>
+      <w:bookmarkEnd w:id="0"/>
+    </w:p>
+    <w:p>
+      <w:pPr>
+        <w:keepNext w:val="0"/>
+        <w:keepLines w:val="0"/>
+        <w:widowControl/>
+        <w:suppressLineNumbers w:val="0"/>
+        <w:shd w:val="clear" w:fill="F5F5F5"/>
+        <w:spacing w:line="190" w:lineRule="atLeast"/>
+        <w:jc w:val="left"/>
+        <w:rPr>
+          <w:rFonts w:hint="default" w:eastAsia="Consolas" w:cs="Consolas" w:asciiTheme="minorAscii" w:hAnsiTheme="minorAscii"/>
+          <w:b w:val="0"/>
+          <w:bCs w:val="0"/>
+          <w:color w:val="333333"/>
+          <w:sz w:val="22"/>
+          <w:szCs w:val="22"/>
+          <w:shd w:val="clear" w:color="auto" w:fill="auto"/>
+        </w:rPr>
+      </w:pPr>
+      <w:r>
+        <w:rPr>
+          <w:rFonts w:hint="default" w:eastAsia="Consolas" w:cs="Consolas" w:asciiTheme="minorAscii" w:hAnsiTheme="minorAscii"/>
+          <w:b w:val="0"/>
+          <w:bCs w:val="0"/>
+          <w:color w:val="333333"/>
+          <w:kern w:val="0"/>
+          <w:sz w:val="22"/>
+          <w:szCs w:val="22"/>
+          <w:shd w:val="clear" w:color="auto" w:fill="auto"/>
+          <w:lang w:val="en-US" w:eastAsia="zh-CN" w:bidi="ar"/>
+        </w:rPr>
+        <w:t>Hangar Straight     straight        full throttle</w:t>
+      </w:r>
+    </w:p>
+    <w:p>
+      <w:pPr>
+        <w:keepNext w:val="0"/>
+        <w:keepLines w:val="0"/>
+        <w:widowControl/>
+        <w:suppressLineNumbers w:val="0"/>
+        <w:shd w:val="clear" w:fill="F5F5F5"/>
+        <w:spacing w:line="190" w:lineRule="atLeast"/>
+        <w:jc w:val="left"/>
+        <w:rPr>
+          <w:rFonts w:hint="default" w:eastAsia="Consolas" w:cs="Consolas" w:asciiTheme="minorAscii" w:hAnsiTheme="minorAscii"/>
+          <w:b w:val="0"/>
+          <w:bCs w:val="0"/>
+          <w:color w:val="333333"/>
+          <w:sz w:val="22"/>
+          <w:szCs w:val="22"/>
+          <w:shd w:val="clear" w:color="auto" w:fill="auto"/>
+        </w:rPr>
+      </w:pPr>
+      <w:r>
+        <w:rPr>
+          <w:rFonts w:hint="default" w:eastAsia="Consolas" w:cs="Consolas" w:asciiTheme="minorAscii" w:hAnsiTheme="minorAscii"/>
+          <w:b w:val="0"/>
+          <w:bCs w:val="0"/>
+          <w:color w:val="333333"/>
+          <w:kern w:val="0"/>
+          <w:sz w:val="22"/>
+          <w:szCs w:val="22"/>
+          <w:shd w:val="clear" w:color="auto" w:fill="auto"/>
+          <w:lang w:val="en-US" w:eastAsia="zh-CN" w:bidi="ar"/>
+        </w:rPr>
+        <w:t>Stowe (T15)         corner          braking zone</w:t>
+      </w:r>
+    </w:p>
+    <w:p>
+      <w:pPr>
+        <w:keepNext w:val="0"/>
+        <w:keepLines w:val="0"/>
+        <w:widowControl/>
+        <w:suppressLineNumbers w:val="0"/>
+        <w:shd w:val="clear" w:fill="F5F5F5"/>
+        <w:spacing w:line="190" w:lineRule="atLeast"/>
+        <w:jc w:val="left"/>
+        <w:rPr>
+          <w:rFonts w:hint="default" w:eastAsia="Consolas" w:cs="Consolas" w:asciiTheme="minorAscii" w:hAnsiTheme="minorAscii"/>
+          <w:b w:val="0"/>
+          <w:bCs w:val="0"/>
+          <w:color w:val="333333"/>
+          <w:sz w:val="22"/>
+          <w:szCs w:val="22"/>
+          <w:shd w:val="clear" w:color="auto" w:fill="auto"/>
+        </w:rPr>
+      </w:pPr>
+      <w:r>
+        <w:rPr>
+          <w:rFonts w:hint="default" w:eastAsia="Consolas" w:cs="Consolas" w:asciiTheme="minorAscii" w:hAnsiTheme="minorAscii"/>
+          <w:b w:val="0"/>
+          <w:bCs w:val="0"/>
+          <w:color w:val="333333"/>
+          <w:kern w:val="0"/>
+          <w:sz w:val="22"/>
+          <w:szCs w:val="22"/>
+          <w:shd w:val="clear" w:color="auto" w:fill="auto"/>
+          <w:lang w:val="en-US" w:eastAsia="zh-CN" w:bidi="ar"/>
+        </w:rPr>
+        <w:t>Vale (T16–17)       corner          complex technical, medium speed</w:t>
+      </w:r>
+    </w:p>
+    <w:p>
+      <w:pPr>
+        <w:keepNext w:val="0"/>
+        <w:keepLines w:val="0"/>
+        <w:widowControl/>
+        <w:suppressLineNumbers w:val="0"/>
+        <w:shd w:val="clear" w:fill="F5F5F5"/>
+        <w:spacing w:line="190" w:lineRule="atLeast"/>
+        <w:jc w:val="left"/>
+        <w:rPr>
+          <w:rFonts w:hint="default" w:eastAsia="Consolas" w:cs="Consolas" w:asciiTheme="minorAscii" w:hAnsiTheme="minorAscii"/>
+          <w:b w:val="0"/>
+          <w:bCs w:val="0"/>
+          <w:color w:val="333333"/>
+          <w:sz w:val="22"/>
+          <w:szCs w:val="22"/>
+          <w:shd w:val="clear" w:color="auto" w:fill="auto"/>
+        </w:rPr>
+      </w:pPr>
+      <w:r>
+        <w:rPr>
+          <w:rFonts w:hint="default" w:eastAsia="Consolas" w:cs="Consolas" w:asciiTheme="minorAscii" w:hAnsiTheme="minorAscii"/>
+          <w:b w:val="0"/>
+          <w:bCs w:val="0"/>
+          <w:color w:val="333333"/>
+          <w:kern w:val="0"/>
+          <w:sz w:val="22"/>
+          <w:szCs w:val="22"/>
+          <w:shd w:val="clear" w:color="auto" w:fill="auto"/>
+          <w:lang w:val="en-US" w:eastAsia="zh-CN" w:bidi="ar"/>
+        </w:rPr>
+        <w:t>Club (T18)          corner          onto Hamilton Straight</w:t>
       </w:r>
     </w:p>
     <w:p>

</xml_diff>

<commit_message>
moved all .h files into the /include folder, changed #include in other folders respectively
</commit_message>
<xml_diff>
--- a/structure and planning.docx
+++ b/structure and planning.docx
@@ -4720,8 +4720,10 @@
                 <w:shd w:val="clear" w:color="auto" w:fill="auto"/>
                 <w:lang w:val="en-GB" w:eastAsia="zh-CN" w:bidi="ar"/>
               </w:rPr>
-              <w:t>167k</w:t>
-            </w:r>
+              <w:t>167</w:t>
+            </w:r>
+            <w:bookmarkStart w:id="0" w:name="_GoBack"/>
+            <w:bookmarkEnd w:id="0"/>
           </w:p>
         </w:tc>
         <w:tc>
@@ -7261,8 +7263,6 @@
           <w:lang w:val="en-GB"/>
         </w:rPr>
       </w:pPr>
-      <w:bookmarkStart w:id="0" w:name="_GoBack"/>
-      <w:bookmarkEnd w:id="0"/>
     </w:p>
     <w:sectPr>
       <w:pgSz w:w="11906" w:h="16838"/>
@@ -7279,7 +7279,7 @@
   <w:docDefaults>
     <w:rPrDefault>
       <w:rPr>
-        <w:rFonts w:ascii="Times New Roman" w:hAnsi="Times New Roman" w:eastAsia="宋体" w:cs="Times New Roman"/>
+        <w:rFonts w:ascii="Times New Roman" w:hAnsi="Times New Roman" w:eastAsia="SimSun" w:cs="Times New Roman"/>
       </w:rPr>
     </w:rPrDefault>
     <w:pPrDefault/>
@@ -7553,7 +7553,7 @@
       <w:jc w:val="left"/>
     </w:pPr>
     <w:rPr>
-      <w:rFonts w:hint="eastAsia" w:ascii="宋体" w:hAnsi="宋体" w:eastAsia="宋体" w:cs="宋体"/>
+      <w:rFonts w:hint="eastAsia" w:ascii="SimSun" w:hAnsi="SimSun" w:eastAsia="SimSun" w:cs="SimSun"/>
       <w:b/>
       <w:bCs/>
       <w:kern w:val="44"/>
@@ -7574,7 +7574,7 @@
       <w:jc w:val="left"/>
     </w:pPr>
     <w:rPr>
-      <w:rFonts w:hint="eastAsia" w:ascii="宋体" w:hAnsi="宋体" w:eastAsia="宋体" w:cs="宋体"/>
+      <w:rFonts w:hint="eastAsia" w:ascii="SimSun" w:hAnsi="SimSun" w:eastAsia="SimSun" w:cs="SimSun"/>
       <w:b/>
       <w:bCs/>
       <w:kern w:val="0"/>
@@ -7650,7 +7650,7 @@
       <w:jc w:val="left"/>
     </w:pPr>
     <w:rPr>
-      <w:rFonts w:hint="eastAsia" w:ascii="宋体" w:hAnsi="宋体" w:eastAsia="宋体" w:cs="宋体"/>
+      <w:rFonts w:hint="eastAsia" w:ascii="SimSun" w:hAnsi="SimSun" w:eastAsia="SimSun" w:cs="SimSun"/>
       <w:kern w:val="0"/>
       <w:sz w:val="24"/>
       <w:szCs w:val="24"/>
@@ -7667,7 +7667,7 @@
       <w:jc w:val="left"/>
     </w:pPr>
     <w:rPr>
-      <w:rFonts w:ascii="Times New Roman" w:hAnsi="Times New Roman" w:eastAsia="宋体" w:cs="Times New Roman"/>
+      <w:rFonts w:ascii="Times New Roman" w:hAnsi="Times New Roman" w:eastAsia="SimSun" w:cs="Times New Roman"/>
       <w:kern w:val="0"/>
       <w:sz w:val="24"/>
       <w:szCs w:val="24"/>

</xml_diff>

<commit_message>
Added more details to the tracks and segments
</commit_message>
<xml_diff>
--- a/structure and planning.docx
+++ b/structure and planning.docx
@@ -9317,9 +9317,19 @@
                 <w:sz w:val="22"/>
                 <w:szCs w:val="22"/>
                 <w:vertAlign w:val="baseline"/>
-                <w:lang w:val="en-US"/>
-              </w:rPr>
-            </w:pPr>
+                <w:lang w:val="en-GB"/>
+              </w:rPr>
+            </w:pPr>
+            <w:r>
+              <w:rPr>
+                <w:rFonts w:hint="default" w:ascii="Calibri" w:hAnsi="Calibri" w:cs="Calibri"/>
+                <w:sz w:val="22"/>
+                <w:szCs w:val="22"/>
+                <w:vertAlign w:val="baseline"/>
+                <w:lang w:val="en-GB"/>
+              </w:rPr>
+              <w:t>167</w:t>
+            </w:r>
           </w:p>
         </w:tc>
         <w:tc>
@@ -9534,9 +9544,19 @@
                 <w:sz w:val="22"/>
                 <w:szCs w:val="22"/>
                 <w:vertAlign w:val="baseline"/>
-                <w:lang w:val="en-US"/>
-              </w:rPr>
-            </w:pPr>
+                <w:lang w:val="en-GB"/>
+              </w:rPr>
+            </w:pPr>
+            <w:r>
+              <w:rPr>
+                <w:rFonts w:hint="default" w:ascii="Calibri" w:hAnsi="Calibri" w:cs="Calibri"/>
+                <w:sz w:val="22"/>
+                <w:szCs w:val="22"/>
+                <w:vertAlign w:val="baseline"/>
+                <w:lang w:val="en-GB"/>
+              </w:rPr>
+              <w:t>262</w:t>
+            </w:r>
           </w:p>
         </w:tc>
         <w:tc>
@@ -11576,6 +11596,20 @@
                 <w:lang w:val="en-GB" w:eastAsia="zh-CN" w:bidi="ar"/>
               </w:rPr>
             </w:pPr>
+            <w:r>
+              <w:rPr>
+                <w:rFonts w:hint="default" w:eastAsia="Consolas" w:cs="Consolas" w:asciiTheme="minorAscii" w:hAnsiTheme="minorAscii"/>
+                <w:b w:val="0"/>
+                <w:bCs w:val="0"/>
+                <w:color w:val="333333"/>
+                <w:kern w:val="0"/>
+                <w:sz w:val="22"/>
+                <w:szCs w:val="22"/>
+                <w:shd w:val="clear" w:color="auto" w:fill="auto"/>
+                <w:lang w:val="en-GB" w:eastAsia="zh-CN" w:bidi="ar"/>
+              </w:rPr>
+              <w:t>119</w:t>
+            </w:r>
           </w:p>
         </w:tc>
         <w:tc>
@@ -12074,6 +12108,20 @@
                 <w:lang w:val="en-GB" w:eastAsia="zh-CN" w:bidi="ar"/>
               </w:rPr>
             </w:pPr>
+            <w:r>
+              <w:rPr>
+                <w:rFonts w:hint="default" w:eastAsia="Consolas" w:cs="Consolas" w:asciiTheme="minorAscii" w:hAnsiTheme="minorAscii"/>
+                <w:b w:val="0"/>
+                <w:bCs w:val="0"/>
+                <w:color w:val="333333"/>
+                <w:kern w:val="0"/>
+                <w:sz w:val="22"/>
+                <w:szCs w:val="22"/>
+                <w:shd w:val="clear" w:color="auto" w:fill="auto"/>
+                <w:lang w:val="en-GB" w:eastAsia="zh-CN" w:bidi="ar"/>
+              </w:rPr>
+              <w:t>143</w:t>
+            </w:r>
           </w:p>
         </w:tc>
         <w:tc>
@@ -12332,6 +12380,20 @@
                 <w:lang w:val="en-GB" w:eastAsia="zh-CN" w:bidi="ar"/>
               </w:rPr>
             </w:pPr>
+            <w:r>
+              <w:rPr>
+                <w:rFonts w:hint="default" w:eastAsia="Consolas" w:cs="Consolas" w:asciiTheme="minorAscii" w:hAnsiTheme="minorAscii"/>
+                <w:b w:val="0"/>
+                <w:bCs w:val="0"/>
+                <w:color w:val="333333"/>
+                <w:kern w:val="0"/>
+                <w:sz w:val="22"/>
+                <w:szCs w:val="22"/>
+                <w:shd w:val="clear" w:color="auto" w:fill="auto"/>
+                <w:lang w:val="en-GB" w:eastAsia="zh-CN" w:bidi="ar"/>
+              </w:rPr>
+              <w:t>119</w:t>
+            </w:r>
           </w:p>
         </w:tc>
         <w:tc>
@@ -12563,6 +12625,22 @@
                 <w:lang w:val="en-GB" w:eastAsia="zh-CN" w:bidi="ar"/>
               </w:rPr>
             </w:pPr>
+            <w:r>
+              <w:rPr>
+                <w:rFonts w:hint="default" w:eastAsia="Consolas" w:cs="Consolas" w:asciiTheme="minorAscii" w:hAnsiTheme="minorAscii"/>
+                <w:b w:val="0"/>
+                <w:bCs w:val="0"/>
+                <w:color w:val="333333"/>
+                <w:kern w:val="0"/>
+                <w:sz w:val="22"/>
+                <w:szCs w:val="22"/>
+                <w:shd w:val="clear" w:color="auto" w:fill="auto"/>
+                <w:lang w:val="en-GB" w:eastAsia="zh-CN" w:bidi="ar"/>
+              </w:rPr>
+              <w:t>143</w:t>
+            </w:r>
+            <w:bookmarkStart w:id="0" w:name="_GoBack"/>
+            <w:bookmarkEnd w:id="0"/>
           </w:p>
         </w:tc>
         <w:tc>
@@ -14177,8 +14255,6 @@
               </w:rPr>
               <w:t>241</w:t>
             </w:r>
-            <w:bookmarkStart w:id="0" w:name="_GoBack"/>
-            <w:bookmarkEnd w:id="0"/>
           </w:p>
         </w:tc>
         <w:tc>

</xml_diff>

<commit_message>
Completed the straight segment section of option table generating
</commit_message>
<xml_diff>
--- a/structure and planning.docx
+++ b/structure and planning.docx
@@ -8534,12 +8534,6 @@
             <w:insideH w:val="single" w:color="auto" w:sz="4" w:space="0"/>
             <w:insideV w:val="single" w:color="auto" w:sz="4" w:space="0"/>
           </w:tblBorders>
-          <w:tblCellMar>
-            <w:top w:w="0" w:type="dxa"/>
-            <w:left w:w="108" w:type="dxa"/>
-            <w:bottom w:w="0" w:type="dxa"/>
-            <w:right w:w="108" w:type="dxa"/>
-          </w:tblCellMar>
         </w:tblPrEx>
         <w:tc>
           <w:tcPr>
@@ -12639,8 +12633,6 @@
               </w:rPr>
               <w:t>143</w:t>
             </w:r>
-            <w:bookmarkStart w:id="0" w:name="_GoBack"/>
-            <w:bookmarkEnd w:id="0"/>
           </w:p>
         </w:tc>
         <w:tc>
@@ -14366,16 +14358,20 @@
         <w:spacing w:line="240" w:lineRule="auto"/>
         <w:rPr>
           <w:rFonts w:hint="default" w:ascii="Calibri" w:hAnsi="Calibri" w:cs="Calibri"/>
-          <w:sz w:val="22"/>
-          <w:szCs w:val="22"/>
+          <w:b/>
+          <w:bCs/>
+          <w:sz w:val="32"/>
+          <w:szCs w:val="32"/>
           <w:lang w:val="en-GB"/>
         </w:rPr>
       </w:pPr>
       <w:r>
         <w:rPr>
           <w:rFonts w:hint="default" w:ascii="Calibri" w:hAnsi="Calibri" w:cs="Calibri"/>
-          <w:sz w:val="22"/>
-          <w:szCs w:val="22"/>
+          <w:b/>
+          <w:bCs/>
+          <w:sz w:val="32"/>
+          <w:szCs w:val="32"/>
           <w:lang w:val="en-GB"/>
         </w:rPr>
         <w:t>Things to think about later:</w:t>
@@ -14390,10 +14386,16 @@
         <w:suppressLineNumbers w:val="0"/>
         <w:spacing w:before="0" w:beforeAutospacing="1" w:after="0" w:afterAutospacing="1"/>
         <w:ind w:left="0" w:right="0"/>
+        <w:rPr>
+          <w:sz w:val="22"/>
+          <w:szCs w:val="22"/>
+        </w:rPr>
       </w:pPr>
       <w:r>
         <w:rPr>
           <w:rStyle w:val="10"/>
+          <w:sz w:val="22"/>
+          <w:szCs w:val="22"/>
         </w:rPr>
         <w:t>3. Worth deciding: single lumped rate-cap per corner, or split into sub-phases?</w:t>
       </w:r>
@@ -14441,11 +14443,1201 @@
     </w:p>
     <w:p>
       <w:pPr>
+        <w:pStyle w:val="9"/>
+        <w:keepNext w:val="0"/>
+        <w:keepLines w:val="0"/>
+        <w:widowControl/>
+        <w:suppressLineNumbers w:val="0"/>
+        <w:spacing w:before="0" w:beforeAutospacing="1" w:after="0" w:afterAutospacing="1"/>
+        <w:ind w:left="0" w:right="0"/>
+      </w:pPr>
+    </w:p>
+    <w:p>
+      <w:pPr>
+        <w:pStyle w:val="9"/>
+        <w:keepNext w:val="0"/>
+        <w:keepLines w:val="0"/>
+        <w:widowControl/>
+        <w:suppressLineNumbers w:val="0"/>
+        <w:spacing w:before="0" w:beforeAutospacing="1" w:after="0" w:afterAutospacing="1"/>
+        <w:ind w:left="0" w:right="0"/>
+      </w:pPr>
+    </w:p>
+    <w:p>
+      <w:pPr>
+        <w:pStyle w:val="9"/>
+        <w:keepNext w:val="0"/>
+        <w:keepLines w:val="0"/>
+        <w:widowControl/>
+        <w:suppressLineNumbers w:val="0"/>
+        <w:spacing w:before="0" w:beforeAutospacing="1" w:after="0" w:afterAutospacing="1"/>
+        <w:ind w:left="0" w:right="0"/>
+      </w:pPr>
+    </w:p>
+    <w:p>
+      <w:pPr>
+        <w:pStyle w:val="9"/>
+        <w:keepNext w:val="0"/>
+        <w:keepLines w:val="0"/>
+        <w:widowControl/>
+        <w:suppressLineNumbers w:val="0"/>
+        <w:spacing w:before="0" w:beforeAutospacing="1" w:after="0" w:afterAutospacing="1"/>
+        <w:ind w:left="0" w:right="0"/>
+        <w:rPr>
+          <w:rFonts w:hint="default" w:asciiTheme="minorAscii" w:hAnsiTheme="minorAscii"/>
+          <w:b w:val="0"/>
+          <w:bCs w:val="0"/>
+          <w:sz w:val="22"/>
+          <w:szCs w:val="22"/>
+          <w:lang w:val="en-GB"/>
+        </w:rPr>
+      </w:pPr>
+      <w:r>
+        <w:rPr>
+          <w:rFonts w:hint="default"/>
+          <w:b/>
+          <w:bCs/>
+          <w:sz w:val="32"/>
+          <w:szCs w:val="32"/>
+          <w:lang w:val="en-GB"/>
+        </w:rPr>
+        <w:t>Places where efficiency could be improved: (First I will validated if the program is working, then improve the efficiency)</w:t>
+      </w:r>
+    </w:p>
+    <w:p>
+      <w:pPr>
+        <w:pStyle w:val="9"/>
+        <w:keepNext w:val="0"/>
+        <w:keepLines w:val="0"/>
+        <w:widowControl/>
+        <w:suppressLineNumbers w:val="0"/>
+        <w:spacing w:before="0" w:beforeAutospacing="1" w:after="0" w:afterAutospacing="1"/>
+        <w:ind w:left="0" w:right="0"/>
+        <w:rPr>
+          <w:rFonts w:hint="default" w:asciiTheme="minorAscii" w:hAnsiTheme="minorAscii"/>
+          <w:b/>
+          <w:bCs/>
+          <w:sz w:val="22"/>
+          <w:szCs w:val="22"/>
+          <w:u w:val="single"/>
+          <w:lang w:val="en-GB"/>
+        </w:rPr>
+      </w:pPr>
+      <w:r>
+        <w:rPr>
+          <w:rFonts w:hint="default" w:asciiTheme="minorAscii" w:hAnsiTheme="minorAscii"/>
+          <w:b/>
+          <w:bCs/>
+          <w:sz w:val="22"/>
+          <w:szCs w:val="22"/>
+          <w:u w:val="single"/>
+          <w:lang w:val="en-GB"/>
+        </w:rPr>
+        <w:t>Optimizer.cpp:</w:t>
+      </w:r>
+    </w:p>
+    <w:p>
+      <w:pPr>
+        <w:pStyle w:val="9"/>
+        <w:keepNext w:val="0"/>
+        <w:keepLines w:val="0"/>
+        <w:widowControl/>
+        <w:suppressLineNumbers w:val="0"/>
+        <w:spacing w:before="0" w:beforeAutospacing="1" w:after="0" w:afterAutospacing="1"/>
+        <w:ind w:left="0" w:right="0"/>
+        <w:rPr>
+          <w:rFonts w:hint="default" w:asciiTheme="minorAscii" w:hAnsiTheme="minorAscii"/>
+          <w:b w:val="0"/>
+          <w:bCs w:val="0"/>
+          <w:sz w:val="22"/>
+          <w:szCs w:val="22"/>
+          <w:lang w:val="en-GB"/>
+        </w:rPr>
+      </w:pPr>
+      <w:r>
+        <w:rPr>
+          <w:rFonts w:hint="default" w:asciiTheme="minorAscii" w:hAnsiTheme="minorAscii"/>
+          <w:b w:val="0"/>
+          <w:bCs w:val="0"/>
+          <w:sz w:val="22"/>
+          <w:szCs w:val="22"/>
+          <w:lang w:val="en-GB"/>
+        </w:rPr>
+        <w:t>#1 — yes, exactly that, and let me fix a mixup: it's not "81 dis values" — the 81 count is the energy buckets; the dis count is however many partitions fit in the straight (length/15, typically 15-55 depending on the segment). The redundancy is the other direction: for a fixed segment, ke_gained, speed, time_deploying, energy_deployed, ke_diff, engine_power, recharge_power only depend on dis — never on which energy bucket you're currently evaluating. So right now, for every one of the 81 buckets, you rerun the entire dis loop and recompute all of that from scratch, even though it comes out identical every single time. Precomputing means: loop over dis once (not 81 times), and for each dis store just what the energy-bucket step actually needs (time_deploying, recharge_power) — same break/continue logic applies here too, since energy_deployed &gt;= initial_battery and engine_power &lt; 0 also only depend on dis, not on the bucket. Shape of it:</w:t>
+      </w:r>
+    </w:p>
+    <w:p>
+      <w:pPr>
+        <w:pStyle w:val="9"/>
+        <w:keepNext w:val="0"/>
+        <w:keepLines w:val="0"/>
+        <w:pageBreakBefore w:val="0"/>
+        <w:widowControl/>
+        <w:suppressLineNumbers w:val="0"/>
+        <w:kinsoku/>
+        <w:wordWrap/>
+        <w:overflowPunct/>
+        <w:topLinePunct w:val="0"/>
+        <w:autoSpaceDE/>
+        <w:autoSpaceDN/>
+        <w:bidi w:val="0"/>
+        <w:adjustRightInd/>
+        <w:snapToGrid/>
+        <w:spacing w:before="120" w:beforeAutospacing="0" w:after="120" w:afterAutospacing="0"/>
+        <w:ind w:left="0" w:right="0"/>
+        <w:textAlignment w:val="auto"/>
+        <w:rPr>
+          <w:rFonts w:hint="default" w:asciiTheme="minorAscii" w:hAnsiTheme="minorAscii"/>
+          <w:b w:val="0"/>
+          <w:bCs w:val="0"/>
+          <w:sz w:val="18"/>
+          <w:szCs w:val="18"/>
+          <w:lang w:val="en-GB"/>
+        </w:rPr>
+      </w:pPr>
+      <w:r>
+        <w:rPr>
+          <w:rFonts w:hint="default" w:asciiTheme="minorAscii" w:hAnsiTheme="minorAscii"/>
+          <w:b w:val="0"/>
+          <w:bCs w:val="0"/>
+          <w:sz w:val="18"/>
+          <w:szCs w:val="18"/>
+          <w:lang w:val="en-GB"/>
+        </w:rPr>
+        <w:t>// once per segment, NOT per energy bucket</w:t>
+      </w:r>
+    </w:p>
+    <w:p>
+      <w:pPr>
+        <w:pStyle w:val="9"/>
+        <w:keepNext w:val="0"/>
+        <w:keepLines w:val="0"/>
+        <w:pageBreakBefore w:val="0"/>
+        <w:widowControl/>
+        <w:suppressLineNumbers w:val="0"/>
+        <w:kinsoku/>
+        <w:wordWrap/>
+        <w:overflowPunct/>
+        <w:topLinePunct w:val="0"/>
+        <w:autoSpaceDE/>
+        <w:autoSpaceDN/>
+        <w:bidi w:val="0"/>
+        <w:adjustRightInd/>
+        <w:snapToGrid/>
+        <w:spacing w:before="120" w:beforeAutospacing="0" w:after="120" w:afterAutospacing="0"/>
+        <w:ind w:left="0" w:right="0"/>
+        <w:textAlignment w:val="auto"/>
+        <w:rPr>
+          <w:rFonts w:hint="default" w:asciiTheme="minorAscii" w:hAnsiTheme="minorAscii"/>
+          <w:b w:val="0"/>
+          <w:bCs w:val="0"/>
+          <w:sz w:val="18"/>
+          <w:szCs w:val="18"/>
+          <w:lang w:val="en-GB"/>
+        </w:rPr>
+      </w:pPr>
+      <w:r>
+        <w:rPr>
+          <w:rFonts w:hint="default" w:asciiTheme="minorAscii" w:hAnsiTheme="minorAscii"/>
+          <w:b w:val="0"/>
+          <w:bCs w:val="0"/>
+          <w:sz w:val="18"/>
+          <w:szCs w:val="18"/>
+          <w:lang w:val="en-GB"/>
+        </w:rPr>
+        <w:t>struct DisPoint { double time_deploying; double recharge_power; };</w:t>
+      </w:r>
+    </w:p>
+    <w:p>
+      <w:pPr>
+        <w:pStyle w:val="9"/>
+        <w:keepNext w:val="0"/>
+        <w:keepLines w:val="0"/>
+        <w:pageBreakBefore w:val="0"/>
+        <w:widowControl/>
+        <w:suppressLineNumbers w:val="0"/>
+        <w:kinsoku/>
+        <w:wordWrap/>
+        <w:overflowPunct/>
+        <w:topLinePunct w:val="0"/>
+        <w:autoSpaceDE/>
+        <w:autoSpaceDN/>
+        <w:bidi w:val="0"/>
+        <w:adjustRightInd/>
+        <w:snapToGrid/>
+        <w:spacing w:before="120" w:beforeAutospacing="0" w:after="120" w:afterAutospacing="0"/>
+        <w:ind w:left="0" w:right="0"/>
+        <w:textAlignment w:val="auto"/>
+        <w:rPr>
+          <w:rFonts w:hint="default" w:asciiTheme="minorAscii" w:hAnsiTheme="minorAscii"/>
+          <w:b w:val="0"/>
+          <w:bCs w:val="0"/>
+          <w:sz w:val="18"/>
+          <w:szCs w:val="18"/>
+          <w:lang w:val="en-GB"/>
+        </w:rPr>
+      </w:pPr>
+      <w:r>
+        <w:rPr>
+          <w:rFonts w:hint="default" w:asciiTheme="minorAscii" w:hAnsiTheme="minorAscii"/>
+          <w:b w:val="0"/>
+          <w:bCs w:val="0"/>
+          <w:sz w:val="18"/>
+          <w:szCs w:val="18"/>
+          <w:lang w:val="en-GB"/>
+        </w:rPr>
+        <w:t>std::vector&lt;DisPoint&gt; dis_table;</w:t>
+      </w:r>
+    </w:p>
+    <w:p>
+      <w:pPr>
+        <w:pStyle w:val="9"/>
+        <w:keepNext w:val="0"/>
+        <w:keepLines w:val="0"/>
+        <w:pageBreakBefore w:val="0"/>
+        <w:widowControl/>
+        <w:suppressLineNumbers w:val="0"/>
+        <w:kinsoku/>
+        <w:wordWrap/>
+        <w:overflowPunct/>
+        <w:topLinePunct w:val="0"/>
+        <w:autoSpaceDE/>
+        <w:autoSpaceDN/>
+        <w:bidi w:val="0"/>
+        <w:adjustRightInd/>
+        <w:snapToGrid/>
+        <w:spacing w:before="120" w:beforeAutospacing="0" w:after="120" w:afterAutospacing="0"/>
+        <w:ind w:left="0" w:right="0"/>
+        <w:textAlignment w:val="auto"/>
+        <w:rPr>
+          <w:rFonts w:hint="default" w:asciiTheme="minorAscii" w:hAnsiTheme="minorAscii"/>
+          <w:b w:val="0"/>
+          <w:bCs w:val="0"/>
+          <w:sz w:val="18"/>
+          <w:szCs w:val="18"/>
+          <w:lang w:val="en-GB"/>
+        </w:rPr>
+      </w:pPr>
+    </w:p>
+    <w:p>
+      <w:pPr>
+        <w:pStyle w:val="9"/>
+        <w:keepNext w:val="0"/>
+        <w:keepLines w:val="0"/>
+        <w:pageBreakBefore w:val="0"/>
+        <w:widowControl/>
+        <w:suppressLineNumbers w:val="0"/>
+        <w:kinsoku/>
+        <w:wordWrap/>
+        <w:overflowPunct/>
+        <w:topLinePunct w:val="0"/>
+        <w:autoSpaceDE/>
+        <w:autoSpaceDN/>
+        <w:bidi w:val="0"/>
+        <w:adjustRightInd/>
+        <w:snapToGrid/>
+        <w:spacing w:before="120" w:beforeAutospacing="0" w:after="120" w:afterAutospacing="0"/>
+        <w:ind w:left="0" w:right="0"/>
+        <w:textAlignment w:val="auto"/>
+        <w:rPr>
+          <w:rFonts w:hint="default" w:asciiTheme="minorAscii" w:hAnsiTheme="minorAscii"/>
+          <w:b w:val="0"/>
+          <w:bCs w:val="0"/>
+          <w:sz w:val="18"/>
+          <w:szCs w:val="18"/>
+          <w:lang w:val="en-GB"/>
+        </w:rPr>
+      </w:pPr>
+      <w:r>
+        <w:rPr>
+          <w:rFonts w:hint="default" w:asciiTheme="minorAscii" w:hAnsiTheme="minorAscii"/>
+          <w:b w:val="0"/>
+          <w:bCs w:val="0"/>
+          <w:sz w:val="18"/>
+          <w:szCs w:val="18"/>
+          <w:lang w:val="en-GB"/>
+        </w:rPr>
+        <w:t>for (int dis = 0; dis &lt; length / partition_size; dis++){</w:t>
+      </w:r>
+    </w:p>
+    <w:p>
+      <w:pPr>
+        <w:pStyle w:val="9"/>
+        <w:keepNext w:val="0"/>
+        <w:keepLines w:val="0"/>
+        <w:pageBreakBefore w:val="0"/>
+        <w:widowControl/>
+        <w:suppressLineNumbers w:val="0"/>
+        <w:kinsoku/>
+        <w:wordWrap/>
+        <w:overflowPunct/>
+        <w:topLinePunct w:val="0"/>
+        <w:autoSpaceDE/>
+        <w:autoSpaceDN/>
+        <w:bidi w:val="0"/>
+        <w:adjustRightInd/>
+        <w:snapToGrid/>
+        <w:spacing w:before="120" w:beforeAutospacing="0" w:after="120" w:afterAutospacing="0"/>
+        <w:ind w:left="0" w:right="0"/>
+        <w:textAlignment w:val="auto"/>
+        <w:rPr>
+          <w:rFonts w:hint="default" w:asciiTheme="minorAscii" w:hAnsiTheme="minorAscii"/>
+          <w:b w:val="0"/>
+          <w:bCs w:val="0"/>
+          <w:sz w:val="18"/>
+          <w:szCs w:val="18"/>
+          <w:lang w:val="en-GB"/>
+        </w:rPr>
+      </w:pPr>
+      <w:r>
+        <w:rPr>
+          <w:rFonts w:hint="default" w:asciiTheme="minorAscii" w:hAnsiTheme="minorAscii"/>
+          <w:b w:val="0"/>
+          <w:bCs w:val="0"/>
+          <w:sz w:val="18"/>
+          <w:szCs w:val="18"/>
+          <w:lang w:val="en-GB"/>
+        </w:rPr>
+        <w:t xml:space="preserve">    // ...compute ke_gained, speed, time_deploying, energy_deployed...</w:t>
+      </w:r>
+    </w:p>
+    <w:p>
+      <w:pPr>
+        <w:pStyle w:val="9"/>
+        <w:keepNext w:val="0"/>
+        <w:keepLines w:val="0"/>
+        <w:pageBreakBefore w:val="0"/>
+        <w:widowControl/>
+        <w:suppressLineNumbers w:val="0"/>
+        <w:kinsoku/>
+        <w:wordWrap/>
+        <w:overflowPunct/>
+        <w:topLinePunct w:val="0"/>
+        <w:autoSpaceDE/>
+        <w:autoSpaceDN/>
+        <w:bidi w:val="0"/>
+        <w:adjustRightInd/>
+        <w:snapToGrid/>
+        <w:spacing w:before="120" w:beforeAutospacing="0" w:after="120" w:afterAutospacing="0"/>
+        <w:ind w:left="0" w:right="0"/>
+        <w:textAlignment w:val="auto"/>
+        <w:rPr>
+          <w:rFonts w:hint="default" w:asciiTheme="minorAscii" w:hAnsiTheme="minorAscii"/>
+          <w:b w:val="0"/>
+          <w:bCs w:val="0"/>
+          <w:sz w:val="18"/>
+          <w:szCs w:val="18"/>
+          <w:lang w:val="en-GB"/>
+        </w:rPr>
+      </w:pPr>
+      <w:r>
+        <w:rPr>
+          <w:rFonts w:hint="default" w:asciiTheme="minorAscii" w:hAnsiTheme="minorAscii"/>
+          <w:b w:val="0"/>
+          <w:bCs w:val="0"/>
+          <w:sz w:val="18"/>
+          <w:szCs w:val="18"/>
+          <w:lang w:val="en-GB"/>
+        </w:rPr>
+        <w:t xml:space="preserve">    if (energy_deployed &gt;= initial_battery * 1000000) break;</w:t>
+      </w:r>
+    </w:p>
+    <w:p>
+      <w:pPr>
+        <w:pStyle w:val="9"/>
+        <w:keepNext w:val="0"/>
+        <w:keepLines w:val="0"/>
+        <w:pageBreakBefore w:val="0"/>
+        <w:widowControl/>
+        <w:suppressLineNumbers w:val="0"/>
+        <w:kinsoku/>
+        <w:wordWrap/>
+        <w:overflowPunct/>
+        <w:topLinePunct w:val="0"/>
+        <w:autoSpaceDE/>
+        <w:autoSpaceDN/>
+        <w:bidi w:val="0"/>
+        <w:adjustRightInd/>
+        <w:snapToGrid/>
+        <w:spacing w:before="120" w:beforeAutospacing="0" w:after="120" w:afterAutospacing="0"/>
+        <w:ind w:left="0" w:right="0"/>
+        <w:textAlignment w:val="auto"/>
+        <w:rPr>
+          <w:rFonts w:hint="default" w:asciiTheme="minorAscii" w:hAnsiTheme="minorAscii"/>
+          <w:b w:val="0"/>
+          <w:bCs w:val="0"/>
+          <w:sz w:val="18"/>
+          <w:szCs w:val="18"/>
+          <w:lang w:val="en-GB"/>
+        </w:rPr>
+      </w:pPr>
+      <w:r>
+        <w:rPr>
+          <w:rFonts w:hint="default" w:asciiTheme="minorAscii" w:hAnsiTheme="minorAscii"/>
+          <w:b w:val="0"/>
+          <w:bCs w:val="0"/>
+          <w:sz w:val="18"/>
+          <w:szCs w:val="18"/>
+          <w:lang w:val="en-GB"/>
+        </w:rPr>
+        <w:t xml:space="preserve">    // ...compute ke_diff, engine_power...</w:t>
+      </w:r>
+    </w:p>
+    <w:p>
+      <w:pPr>
+        <w:pStyle w:val="9"/>
+        <w:keepNext w:val="0"/>
+        <w:keepLines w:val="0"/>
+        <w:pageBreakBefore w:val="0"/>
+        <w:widowControl/>
+        <w:suppressLineNumbers w:val="0"/>
+        <w:kinsoku/>
+        <w:wordWrap/>
+        <w:overflowPunct/>
+        <w:topLinePunct w:val="0"/>
+        <w:autoSpaceDE/>
+        <w:autoSpaceDN/>
+        <w:bidi w:val="0"/>
+        <w:adjustRightInd/>
+        <w:snapToGrid/>
+        <w:spacing w:before="120" w:beforeAutospacing="0" w:after="120" w:afterAutospacing="0"/>
+        <w:ind w:left="0" w:right="0"/>
+        <w:textAlignment w:val="auto"/>
+        <w:rPr>
+          <w:rFonts w:hint="default" w:asciiTheme="minorAscii" w:hAnsiTheme="minorAscii"/>
+          <w:b w:val="0"/>
+          <w:bCs w:val="0"/>
+          <w:sz w:val="18"/>
+          <w:szCs w:val="18"/>
+          <w:lang w:val="en-GB"/>
+        </w:rPr>
+      </w:pPr>
+      <w:r>
+        <w:rPr>
+          <w:rFonts w:hint="default" w:asciiTheme="minorAscii" w:hAnsiTheme="minorAscii"/>
+          <w:b w:val="0"/>
+          <w:bCs w:val="0"/>
+          <w:sz w:val="18"/>
+          <w:szCs w:val="18"/>
+          <w:lang w:val="en-GB"/>
+        </w:rPr>
+        <w:t xml:space="preserve">    if (engine_power &lt; 0) break;</w:t>
+      </w:r>
+    </w:p>
+    <w:p>
+      <w:pPr>
+        <w:pStyle w:val="9"/>
+        <w:keepNext w:val="0"/>
+        <w:keepLines w:val="0"/>
+        <w:pageBreakBefore w:val="0"/>
+        <w:widowControl/>
+        <w:suppressLineNumbers w:val="0"/>
+        <w:kinsoku/>
+        <w:wordWrap/>
+        <w:overflowPunct/>
+        <w:topLinePunct w:val="0"/>
+        <w:autoSpaceDE/>
+        <w:autoSpaceDN/>
+        <w:bidi w:val="0"/>
+        <w:adjustRightInd/>
+        <w:snapToGrid/>
+        <w:spacing w:before="120" w:beforeAutospacing="0" w:after="120" w:afterAutospacing="0"/>
+        <w:ind w:left="0" w:right="0"/>
+        <w:textAlignment w:val="auto"/>
+        <w:rPr>
+          <w:rFonts w:hint="default" w:asciiTheme="minorAscii" w:hAnsiTheme="minorAscii"/>
+          <w:b w:val="0"/>
+          <w:bCs w:val="0"/>
+          <w:sz w:val="18"/>
+          <w:szCs w:val="18"/>
+          <w:lang w:val="en-GB"/>
+        </w:rPr>
+      </w:pPr>
+      <w:r>
+        <w:rPr>
+          <w:rFonts w:hint="default" w:asciiTheme="minorAscii" w:hAnsiTheme="minorAscii"/>
+          <w:b w:val="0"/>
+          <w:bCs w:val="0"/>
+          <w:sz w:val="18"/>
+          <w:szCs w:val="18"/>
+          <w:lang w:val="en-GB"/>
+        </w:rPr>
+        <w:t xml:space="preserve">    // ...compute recharge_power (with the clamp)...</w:t>
+      </w:r>
+    </w:p>
+    <w:p>
+      <w:pPr>
+        <w:pStyle w:val="9"/>
+        <w:keepNext w:val="0"/>
+        <w:keepLines w:val="0"/>
+        <w:pageBreakBefore w:val="0"/>
+        <w:widowControl/>
+        <w:suppressLineNumbers w:val="0"/>
+        <w:kinsoku/>
+        <w:wordWrap/>
+        <w:overflowPunct/>
+        <w:topLinePunct w:val="0"/>
+        <w:autoSpaceDE/>
+        <w:autoSpaceDN/>
+        <w:bidi w:val="0"/>
+        <w:adjustRightInd/>
+        <w:snapToGrid/>
+        <w:spacing w:before="120" w:beforeAutospacing="0" w:after="120" w:afterAutospacing="0"/>
+        <w:ind w:left="0" w:right="0"/>
+        <w:textAlignment w:val="auto"/>
+        <w:rPr>
+          <w:rFonts w:hint="default" w:asciiTheme="minorAscii" w:hAnsiTheme="minorAscii"/>
+          <w:b w:val="0"/>
+          <w:bCs w:val="0"/>
+          <w:sz w:val="18"/>
+          <w:szCs w:val="18"/>
+          <w:lang w:val="en-GB"/>
+        </w:rPr>
+      </w:pPr>
+      <w:r>
+        <w:rPr>
+          <w:rFonts w:hint="default" w:asciiTheme="minorAscii" w:hAnsiTheme="minorAscii"/>
+          <w:b w:val="0"/>
+          <w:bCs w:val="0"/>
+          <w:sz w:val="18"/>
+          <w:szCs w:val="18"/>
+          <w:lang w:val="en-GB"/>
+        </w:rPr>
+        <w:t xml:space="preserve">    dis_table.push_back({time_deploying, recharge_power});</w:t>
+      </w:r>
+    </w:p>
+    <w:p>
+      <w:pPr>
+        <w:pStyle w:val="9"/>
+        <w:keepNext w:val="0"/>
+        <w:keepLines w:val="0"/>
+        <w:pageBreakBefore w:val="0"/>
+        <w:widowControl/>
+        <w:suppressLineNumbers w:val="0"/>
+        <w:kinsoku/>
+        <w:wordWrap/>
+        <w:overflowPunct/>
+        <w:topLinePunct w:val="0"/>
+        <w:autoSpaceDE/>
+        <w:autoSpaceDN/>
+        <w:bidi w:val="0"/>
+        <w:adjustRightInd/>
+        <w:snapToGrid/>
+        <w:spacing w:before="120" w:beforeAutospacing="0" w:after="120" w:afterAutospacing="0"/>
+        <w:ind w:left="0" w:right="0"/>
+        <w:textAlignment w:val="auto"/>
+        <w:rPr>
+          <w:rFonts w:hint="default" w:asciiTheme="minorAscii" w:hAnsiTheme="minorAscii"/>
+          <w:b w:val="0"/>
+          <w:bCs w:val="0"/>
+          <w:sz w:val="18"/>
+          <w:szCs w:val="18"/>
+          <w:lang w:val="en-GB"/>
+        </w:rPr>
+      </w:pPr>
+      <w:r>
+        <w:rPr>
+          <w:rFonts w:hint="default" w:asciiTheme="minorAscii" w:hAnsiTheme="minorAscii"/>
+          <w:b w:val="0"/>
+          <w:bCs w:val="0"/>
+          <w:sz w:val="18"/>
+          <w:szCs w:val="18"/>
+          <w:lang w:val="en-GB"/>
+        </w:rPr>
+        <w:t>}</w:t>
+      </w:r>
+    </w:p>
+    <w:p>
+      <w:pPr>
+        <w:pStyle w:val="9"/>
+        <w:keepNext w:val="0"/>
+        <w:keepLines w:val="0"/>
+        <w:pageBreakBefore w:val="0"/>
+        <w:widowControl/>
+        <w:suppressLineNumbers w:val="0"/>
+        <w:kinsoku/>
+        <w:wordWrap/>
+        <w:overflowPunct/>
+        <w:topLinePunct w:val="0"/>
+        <w:autoSpaceDE/>
+        <w:autoSpaceDN/>
+        <w:bidi w:val="0"/>
+        <w:adjustRightInd/>
+        <w:snapToGrid/>
+        <w:spacing w:before="120" w:beforeAutospacing="0" w:after="120" w:afterAutospacing="0"/>
+        <w:ind w:left="0" w:right="0"/>
+        <w:textAlignment w:val="auto"/>
+        <w:rPr>
+          <w:rFonts w:hint="default" w:asciiTheme="minorAscii" w:hAnsiTheme="minorAscii"/>
+          <w:b w:val="0"/>
+          <w:bCs w:val="0"/>
+          <w:sz w:val="18"/>
+          <w:szCs w:val="18"/>
+          <w:lang w:val="en-GB"/>
+        </w:rPr>
+      </w:pPr>
+    </w:p>
+    <w:p>
+      <w:pPr>
+        <w:pStyle w:val="9"/>
+        <w:keepNext w:val="0"/>
+        <w:keepLines w:val="0"/>
+        <w:pageBreakBefore w:val="0"/>
+        <w:widowControl/>
+        <w:suppressLineNumbers w:val="0"/>
+        <w:kinsoku/>
+        <w:wordWrap/>
+        <w:overflowPunct/>
+        <w:topLinePunct w:val="0"/>
+        <w:autoSpaceDE/>
+        <w:autoSpaceDN/>
+        <w:bidi w:val="0"/>
+        <w:adjustRightInd/>
+        <w:snapToGrid/>
+        <w:spacing w:before="120" w:beforeAutospacing="0" w:after="120" w:afterAutospacing="0"/>
+        <w:ind w:left="0" w:right="0"/>
+        <w:textAlignment w:val="auto"/>
+        <w:rPr>
+          <w:rFonts w:hint="default" w:asciiTheme="minorAscii" w:hAnsiTheme="minorAscii"/>
+          <w:b w:val="0"/>
+          <w:bCs w:val="0"/>
+          <w:sz w:val="18"/>
+          <w:szCs w:val="18"/>
+          <w:lang w:val="en-GB"/>
+        </w:rPr>
+      </w:pPr>
+      <w:r>
+        <w:rPr>
+          <w:rFonts w:hint="default" w:asciiTheme="minorAscii" w:hAnsiTheme="minorAscii"/>
+          <w:b w:val="0"/>
+          <w:bCs w:val="0"/>
+          <w:sz w:val="18"/>
+          <w:szCs w:val="18"/>
+          <w:lang w:val="en-GB"/>
+        </w:rPr>
+        <w:t>// then per energy bucket (81 times), just the cheap part:</w:t>
+      </w:r>
+    </w:p>
+    <w:p>
+      <w:pPr>
+        <w:pStyle w:val="9"/>
+        <w:keepNext w:val="0"/>
+        <w:keepLines w:val="0"/>
+        <w:pageBreakBefore w:val="0"/>
+        <w:widowControl/>
+        <w:suppressLineNumbers w:val="0"/>
+        <w:kinsoku/>
+        <w:wordWrap/>
+        <w:overflowPunct/>
+        <w:topLinePunct w:val="0"/>
+        <w:autoSpaceDE/>
+        <w:autoSpaceDN/>
+        <w:bidi w:val="0"/>
+        <w:adjustRightInd/>
+        <w:snapToGrid/>
+        <w:spacing w:before="120" w:beforeAutospacing="0" w:after="120" w:afterAutospacing="0"/>
+        <w:ind w:left="0" w:right="0"/>
+        <w:textAlignment w:val="auto"/>
+        <w:rPr>
+          <w:rFonts w:hint="default" w:asciiTheme="minorAscii" w:hAnsiTheme="minorAscii"/>
+          <w:b w:val="0"/>
+          <w:bCs w:val="0"/>
+          <w:sz w:val="18"/>
+          <w:szCs w:val="18"/>
+          <w:lang w:val="en-GB"/>
+        </w:rPr>
+      </w:pPr>
+      <w:r>
+        <w:rPr>
+          <w:rFonts w:hint="default" w:asciiTheme="minorAscii" w:hAnsiTheme="minorAscii"/>
+          <w:b w:val="0"/>
+          <w:bCs w:val="0"/>
+          <w:sz w:val="18"/>
+          <w:szCs w:val="18"/>
+          <w:lang w:val="en-GB"/>
+        </w:rPr>
+        <w:t>for (int energy = 0; energy &lt; bucket_num; energy++){</w:t>
+      </w:r>
+    </w:p>
+    <w:p>
+      <w:pPr>
+        <w:pStyle w:val="9"/>
+        <w:keepNext w:val="0"/>
+        <w:keepLines w:val="0"/>
+        <w:pageBreakBefore w:val="0"/>
+        <w:widowControl/>
+        <w:suppressLineNumbers w:val="0"/>
+        <w:kinsoku/>
+        <w:wordWrap/>
+        <w:overflowPunct/>
+        <w:topLinePunct w:val="0"/>
+        <w:autoSpaceDE/>
+        <w:autoSpaceDN/>
+        <w:bidi w:val="0"/>
+        <w:adjustRightInd/>
+        <w:snapToGrid/>
+        <w:spacing w:before="120" w:beforeAutospacing="0" w:after="120" w:afterAutospacing="0"/>
+        <w:ind w:left="0" w:right="0"/>
+        <w:textAlignment w:val="auto"/>
+        <w:rPr>
+          <w:rFonts w:hint="default" w:asciiTheme="minorAscii" w:hAnsiTheme="minorAscii"/>
+          <w:b w:val="0"/>
+          <w:bCs w:val="0"/>
+          <w:sz w:val="18"/>
+          <w:szCs w:val="18"/>
+          <w:lang w:val="en-GB"/>
+        </w:rPr>
+      </w:pPr>
+      <w:r>
+        <w:rPr>
+          <w:rFonts w:hint="default" w:asciiTheme="minorAscii" w:hAnsiTheme="minorAscii"/>
+          <w:b w:val="0"/>
+          <w:bCs w:val="0"/>
+          <w:sz w:val="18"/>
+          <w:szCs w:val="18"/>
+          <w:lang w:val="en-GB"/>
+        </w:rPr>
+        <w:t xml:space="preserve">    double energy_J = ...;</w:t>
+      </w:r>
+    </w:p>
+    <w:p>
+      <w:pPr>
+        <w:pStyle w:val="9"/>
+        <w:keepNext w:val="0"/>
+        <w:keepLines w:val="0"/>
+        <w:pageBreakBefore w:val="0"/>
+        <w:widowControl/>
+        <w:suppressLineNumbers w:val="0"/>
+        <w:kinsoku/>
+        <w:wordWrap/>
+        <w:overflowPunct/>
+        <w:topLinePunct w:val="0"/>
+        <w:autoSpaceDE/>
+        <w:autoSpaceDN/>
+        <w:bidi w:val="0"/>
+        <w:adjustRightInd/>
+        <w:snapToGrid/>
+        <w:spacing w:before="120" w:beforeAutospacing="0" w:after="120" w:afterAutospacing="0"/>
+        <w:ind w:left="0" w:right="0"/>
+        <w:textAlignment w:val="auto"/>
+        <w:rPr>
+          <w:rFonts w:hint="default" w:asciiTheme="minorAscii" w:hAnsiTheme="minorAscii"/>
+          <w:b w:val="0"/>
+          <w:bCs w:val="0"/>
+          <w:sz w:val="18"/>
+          <w:szCs w:val="18"/>
+          <w:lang w:val="en-GB"/>
+        </w:rPr>
+      </w:pPr>
+      <w:r>
+        <w:rPr>
+          <w:rFonts w:hint="default" w:asciiTheme="minorAscii" w:hAnsiTheme="minorAscii"/>
+          <w:b w:val="0"/>
+          <w:bCs w:val="0"/>
+          <w:sz w:val="18"/>
+          <w:szCs w:val="18"/>
+          <w:lang w:val="en-GB"/>
+        </w:rPr>
+        <w:t xml:space="preserve">    double best_time = infinity;</w:t>
+      </w:r>
+    </w:p>
+    <w:p>
+      <w:pPr>
+        <w:pStyle w:val="9"/>
+        <w:keepNext w:val="0"/>
+        <w:keepLines w:val="0"/>
+        <w:pageBreakBefore w:val="0"/>
+        <w:widowControl/>
+        <w:suppressLineNumbers w:val="0"/>
+        <w:kinsoku/>
+        <w:wordWrap/>
+        <w:overflowPunct/>
+        <w:topLinePunct w:val="0"/>
+        <w:autoSpaceDE/>
+        <w:autoSpaceDN/>
+        <w:bidi w:val="0"/>
+        <w:adjustRightInd/>
+        <w:snapToGrid/>
+        <w:spacing w:before="120" w:beforeAutospacing="0" w:after="120" w:afterAutospacing="0"/>
+        <w:ind w:left="0" w:right="0"/>
+        <w:textAlignment w:val="auto"/>
+        <w:rPr>
+          <w:rFonts w:hint="default" w:asciiTheme="minorAscii" w:hAnsiTheme="minorAscii"/>
+          <w:b w:val="0"/>
+          <w:bCs w:val="0"/>
+          <w:sz w:val="18"/>
+          <w:szCs w:val="18"/>
+          <w:lang w:val="en-GB"/>
+        </w:rPr>
+      </w:pPr>
+      <w:r>
+        <w:rPr>
+          <w:rFonts w:hint="default" w:asciiTheme="minorAscii" w:hAnsiTheme="minorAscii"/>
+          <w:b w:val="0"/>
+          <w:bCs w:val="0"/>
+          <w:sz w:val="18"/>
+          <w:szCs w:val="18"/>
+          <w:lang w:val="en-GB"/>
+        </w:rPr>
+        <w:t xml:space="preserve">    for (const auto&amp; d : dis_table){</w:t>
+      </w:r>
+    </w:p>
+    <w:p>
+      <w:pPr>
+        <w:pStyle w:val="9"/>
+        <w:keepNext w:val="0"/>
+        <w:keepLines w:val="0"/>
+        <w:pageBreakBefore w:val="0"/>
+        <w:widowControl/>
+        <w:suppressLineNumbers w:val="0"/>
+        <w:kinsoku/>
+        <w:wordWrap/>
+        <w:overflowPunct/>
+        <w:topLinePunct w:val="0"/>
+        <w:autoSpaceDE/>
+        <w:autoSpaceDN/>
+        <w:bidi w:val="0"/>
+        <w:adjustRightInd/>
+        <w:snapToGrid/>
+        <w:spacing w:before="120" w:beforeAutospacing="0" w:after="120" w:afterAutospacing="0"/>
+        <w:ind w:left="0" w:right="0"/>
+        <w:textAlignment w:val="auto"/>
+        <w:rPr>
+          <w:rFonts w:hint="default" w:asciiTheme="minorAscii" w:hAnsiTheme="minorAscii"/>
+          <w:b w:val="0"/>
+          <w:bCs w:val="0"/>
+          <w:sz w:val="18"/>
+          <w:szCs w:val="18"/>
+          <w:lang w:val="en-GB"/>
+        </w:rPr>
+      </w:pPr>
+      <w:r>
+        <w:rPr>
+          <w:rFonts w:hint="default" w:asciiTheme="minorAscii" w:hAnsiTheme="minorAscii"/>
+          <w:b w:val="0"/>
+          <w:bCs w:val="0"/>
+          <w:sz w:val="18"/>
+          <w:szCs w:val="18"/>
+          <w:lang w:val="en-GB"/>
+        </w:rPr>
+        <w:t xml:space="preserve">        double time_harvesting = (energy_J + p::MGU_K*1000 * d.time_deploying) / d.recharge_power;</w:t>
+      </w:r>
+    </w:p>
+    <w:p>
+      <w:pPr>
+        <w:pStyle w:val="9"/>
+        <w:keepNext w:val="0"/>
+        <w:keepLines w:val="0"/>
+        <w:pageBreakBefore w:val="0"/>
+        <w:widowControl/>
+        <w:suppressLineNumbers w:val="0"/>
+        <w:kinsoku/>
+        <w:wordWrap/>
+        <w:overflowPunct/>
+        <w:topLinePunct w:val="0"/>
+        <w:autoSpaceDE/>
+        <w:autoSpaceDN/>
+        <w:bidi w:val="0"/>
+        <w:adjustRightInd/>
+        <w:snapToGrid/>
+        <w:spacing w:before="120" w:beforeAutospacing="0" w:after="120" w:afterAutospacing="0"/>
+        <w:ind w:left="0" w:right="0"/>
+        <w:textAlignment w:val="auto"/>
+        <w:rPr>
+          <w:rFonts w:hint="default" w:asciiTheme="minorAscii" w:hAnsiTheme="minorAscii"/>
+          <w:b w:val="0"/>
+          <w:bCs w:val="0"/>
+          <w:sz w:val="18"/>
+          <w:szCs w:val="18"/>
+          <w:lang w:val="en-GB"/>
+        </w:rPr>
+      </w:pPr>
+      <w:r>
+        <w:rPr>
+          <w:rFonts w:hint="default" w:asciiTheme="minorAscii" w:hAnsiTheme="minorAscii"/>
+          <w:b w:val="0"/>
+          <w:bCs w:val="0"/>
+          <w:sz w:val="18"/>
+          <w:szCs w:val="18"/>
+          <w:lang w:val="en-GB"/>
+        </w:rPr>
+        <w:t xml:space="preserve">        if (time_harvesting &lt;= 0) continue;</w:t>
+      </w:r>
+    </w:p>
+    <w:p>
+      <w:pPr>
+        <w:pStyle w:val="9"/>
+        <w:keepNext w:val="0"/>
+        <w:keepLines w:val="0"/>
+        <w:pageBreakBefore w:val="0"/>
+        <w:widowControl/>
+        <w:suppressLineNumbers w:val="0"/>
+        <w:kinsoku/>
+        <w:wordWrap/>
+        <w:overflowPunct/>
+        <w:topLinePunct w:val="0"/>
+        <w:autoSpaceDE/>
+        <w:autoSpaceDN/>
+        <w:bidi w:val="0"/>
+        <w:adjustRightInd/>
+        <w:snapToGrid/>
+        <w:spacing w:before="120" w:beforeAutospacing="0" w:after="120" w:afterAutospacing="0"/>
+        <w:ind w:left="0" w:right="0"/>
+        <w:textAlignment w:val="auto"/>
+        <w:rPr>
+          <w:rFonts w:hint="default" w:asciiTheme="minorAscii" w:hAnsiTheme="minorAscii"/>
+          <w:b w:val="0"/>
+          <w:bCs w:val="0"/>
+          <w:sz w:val="18"/>
+          <w:szCs w:val="18"/>
+          <w:lang w:val="en-GB"/>
+        </w:rPr>
+      </w:pPr>
+      <w:r>
+        <w:rPr>
+          <w:rFonts w:hint="default" w:asciiTheme="minorAscii" w:hAnsiTheme="minorAscii"/>
+          <w:b w:val="0"/>
+          <w:bCs w:val="0"/>
+          <w:sz w:val="18"/>
+          <w:szCs w:val="18"/>
+          <w:lang w:val="en-GB"/>
+        </w:rPr>
+        <w:t xml:space="preserve">        double total_time = time_harvesting + d.time_deploying;</w:t>
+      </w:r>
+    </w:p>
+    <w:p>
+      <w:pPr>
+        <w:pStyle w:val="9"/>
+        <w:keepNext w:val="0"/>
+        <w:keepLines w:val="0"/>
+        <w:pageBreakBefore w:val="0"/>
+        <w:widowControl/>
+        <w:suppressLineNumbers w:val="0"/>
+        <w:kinsoku/>
+        <w:wordWrap/>
+        <w:overflowPunct/>
+        <w:topLinePunct w:val="0"/>
+        <w:autoSpaceDE/>
+        <w:autoSpaceDN/>
+        <w:bidi w:val="0"/>
+        <w:adjustRightInd/>
+        <w:snapToGrid/>
+        <w:spacing w:before="120" w:beforeAutospacing="0" w:after="120" w:afterAutospacing="0"/>
+        <w:ind w:left="0" w:right="0"/>
+        <w:textAlignment w:val="auto"/>
+        <w:rPr>
+          <w:rFonts w:hint="default" w:asciiTheme="minorAscii" w:hAnsiTheme="minorAscii"/>
+          <w:b w:val="0"/>
+          <w:bCs w:val="0"/>
+          <w:sz w:val="18"/>
+          <w:szCs w:val="18"/>
+          <w:lang w:val="en-GB"/>
+        </w:rPr>
+      </w:pPr>
+      <w:r>
+        <w:rPr>
+          <w:rFonts w:hint="default" w:asciiTheme="minorAscii" w:hAnsiTheme="minorAscii"/>
+          <w:b w:val="0"/>
+          <w:bCs w:val="0"/>
+          <w:sz w:val="18"/>
+          <w:szCs w:val="18"/>
+          <w:lang w:val="en-GB"/>
+        </w:rPr>
+        <w:t xml:space="preserve">        if (total_time &lt; best_time) best_time = total_time;</w:t>
+      </w:r>
+    </w:p>
+    <w:p>
+      <w:pPr>
+        <w:pStyle w:val="9"/>
+        <w:keepNext w:val="0"/>
+        <w:keepLines w:val="0"/>
+        <w:pageBreakBefore w:val="0"/>
+        <w:widowControl/>
+        <w:suppressLineNumbers w:val="0"/>
+        <w:kinsoku/>
+        <w:wordWrap/>
+        <w:overflowPunct/>
+        <w:topLinePunct w:val="0"/>
+        <w:autoSpaceDE/>
+        <w:autoSpaceDN/>
+        <w:bidi w:val="0"/>
+        <w:adjustRightInd/>
+        <w:snapToGrid/>
+        <w:spacing w:before="120" w:beforeAutospacing="0" w:after="120" w:afterAutospacing="0"/>
+        <w:ind w:left="0" w:right="0"/>
+        <w:textAlignment w:val="auto"/>
+        <w:rPr>
+          <w:rFonts w:hint="default" w:asciiTheme="minorAscii" w:hAnsiTheme="minorAscii"/>
+          <w:b w:val="0"/>
+          <w:bCs w:val="0"/>
+          <w:sz w:val="18"/>
+          <w:szCs w:val="18"/>
+          <w:lang w:val="en-GB"/>
+        </w:rPr>
+      </w:pPr>
+      <w:r>
+        <w:rPr>
+          <w:rFonts w:hint="default" w:asciiTheme="minorAscii" w:hAnsiTheme="minorAscii"/>
+          <w:b w:val="0"/>
+          <w:bCs w:val="0"/>
+          <w:sz w:val="18"/>
+          <w:szCs w:val="18"/>
+          <w:lang w:val="en-GB"/>
+        </w:rPr>
+        <w:t xml:space="preserve">    }</w:t>
+      </w:r>
+    </w:p>
+    <w:p>
+      <w:pPr>
+        <w:pStyle w:val="9"/>
+        <w:keepNext w:val="0"/>
+        <w:keepLines w:val="0"/>
+        <w:pageBreakBefore w:val="0"/>
+        <w:widowControl/>
+        <w:suppressLineNumbers w:val="0"/>
+        <w:kinsoku/>
+        <w:wordWrap/>
+        <w:overflowPunct/>
+        <w:topLinePunct w:val="0"/>
+        <w:autoSpaceDE/>
+        <w:autoSpaceDN/>
+        <w:bidi w:val="0"/>
+        <w:adjustRightInd/>
+        <w:snapToGrid/>
+        <w:spacing w:before="120" w:beforeAutospacing="0" w:after="120" w:afterAutospacing="0"/>
+        <w:ind w:left="0" w:right="0"/>
+        <w:textAlignment w:val="auto"/>
+        <w:rPr>
+          <w:rFonts w:hint="default" w:asciiTheme="minorAscii" w:hAnsiTheme="minorAscii"/>
+          <w:b w:val="0"/>
+          <w:bCs w:val="0"/>
+          <w:sz w:val="18"/>
+          <w:szCs w:val="18"/>
+          <w:lang w:val="en-GB"/>
+        </w:rPr>
+      </w:pPr>
+      <w:r>
+        <w:rPr>
+          <w:rFonts w:hint="default" w:asciiTheme="minorAscii" w:hAnsiTheme="minorAscii"/>
+          <w:b w:val="0"/>
+          <w:bCs w:val="0"/>
+          <w:sz w:val="18"/>
+          <w:szCs w:val="18"/>
+          <w:lang w:val="en-GB"/>
+        </w:rPr>
+        <w:t xml:space="preserve">    option_table.push_back({energy_J/1000000, best_time});  }</w:t>
+      </w:r>
+    </w:p>
+    <w:p>
+      <w:pPr>
+        <w:pStyle w:val="9"/>
+        <w:keepNext w:val="0"/>
+        <w:keepLines w:val="0"/>
+        <w:pageBreakBefore w:val="0"/>
+        <w:widowControl/>
+        <w:suppressLineNumbers w:val="0"/>
+        <w:kinsoku/>
+        <w:wordWrap/>
+        <w:overflowPunct/>
+        <w:topLinePunct w:val="0"/>
+        <w:autoSpaceDE/>
+        <w:autoSpaceDN/>
+        <w:bidi w:val="0"/>
+        <w:adjustRightInd/>
+        <w:snapToGrid/>
+        <w:spacing w:before="120" w:beforeAutospacing="0" w:after="120" w:afterAutospacing="0"/>
+        <w:ind w:left="0" w:right="0"/>
+        <w:textAlignment w:val="auto"/>
+        <w:rPr>
+          <w:rFonts w:hint="default" w:asciiTheme="minorAscii" w:hAnsiTheme="minorAscii"/>
+          <w:b w:val="0"/>
+          <w:bCs w:val="0"/>
+          <w:sz w:val="22"/>
+          <w:szCs w:val="22"/>
+          <w:lang w:val="en-GB"/>
+        </w:rPr>
+      </w:pPr>
+      <w:r>
+        <w:rPr>
+          <w:rFonts w:hint="default" w:asciiTheme="minorAscii" w:hAnsiTheme="minorAscii"/>
+          <w:b w:val="0"/>
+          <w:bCs w:val="0"/>
+          <w:sz w:val="22"/>
+          <w:szCs w:val="22"/>
+          <w:lang w:val="en-GB"/>
+        </w:rPr>
+        <w:t>#2 segment_options(index, battery) gets recomputed once per ending_battery value, redundantly. Its own signature proves it doesn't depend on ending_battery — yet dp_algorithm calls it fresh every time it hits a new (index, battery, ending_battery) state, and with battery_buckets=41, the same (index, battery) pair gets recomputed up to 41 times across different ending_batterys. Worth a small separate cache — e.g. std::vector&lt;std::optional&lt;std::vector&lt;Option&gt;&gt;&gt; sized circuit.size() * battery_buckets, indexed by just (index, battery_bucket), populated lazily the first time each pair is seen. Combined with #1, this compounds significantly.</w:t>
+      </w:r>
+      <w:bookmarkStart w:id="0" w:name="_GoBack"/>
+      <w:bookmarkEnd w:id="0"/>
+    </w:p>
+    <w:p>
+      <w:pPr>
+        <w:pStyle w:val="9"/>
+        <w:keepNext w:val="0"/>
+        <w:keepLines w:val="0"/>
+        <w:pageBreakBefore w:val="0"/>
+        <w:widowControl/>
+        <w:suppressLineNumbers w:val="0"/>
+        <w:kinsoku/>
+        <w:wordWrap/>
+        <w:overflowPunct/>
+        <w:topLinePunct w:val="0"/>
+        <w:autoSpaceDE/>
+        <w:autoSpaceDN/>
+        <w:bidi w:val="0"/>
+        <w:adjustRightInd/>
+        <w:snapToGrid/>
+        <w:spacing w:before="120" w:beforeAutospacing="0" w:after="120" w:afterAutospacing="0"/>
+        <w:ind w:left="0" w:right="0"/>
+        <w:textAlignment w:val="auto"/>
+        <w:rPr>
+          <w:rFonts w:hint="default" w:asciiTheme="minorAscii" w:hAnsiTheme="minorAscii"/>
+          <w:b w:val="0"/>
+          <w:bCs w:val="0"/>
+          <w:sz w:val="22"/>
+          <w:szCs w:val="22"/>
+          <w:lang w:val="en-GB"/>
+        </w:rPr>
+      </w:pPr>
+      <w:r>
+        <w:rPr>
+          <w:rFonts w:hint="default" w:asciiTheme="minorAscii" w:hAnsiTheme="minorAscii"/>
+          <w:b w:val="0"/>
+          <w:bCs w:val="0"/>
+          <w:sz w:val="22"/>
+          <w:szCs w:val="22"/>
+          <w:lang w:val="en-GB"/>
+        </w:rPr>
+        <w:t>— I think there's a mixup on this one, worth double-checking before you leave it. I wasn't suggesting reuse across segments — you're right that the table is completely different once index changes. What I mean is narrower: for the same index and the same battery value, calling segment_options(index, battery) gives you back an identical vector no matter what ending_battery is — because the function's own parameter list doesn't include ending_battery at all, so it's physically incapable of producing a different answer based on it. But dp_algorithm(index, battery, ending_battery) calls it fresh every time it's invoked with a new ending_battery, so for one fixed (index, battery) pair you're redoing that same expensive computation up to 41 times (once per ending_battery bucket) for an identical result each time. It's a smaller, separate cache from the per-index table you're picturing — keyed on (index, battery) only, one dimension narrower than the DP's own memo table. Worth reconsidering with that distinction in mind, but your call.</w:t>
+      </w:r>
+    </w:p>
+    <w:p>
+      <w:pPr>
+        <w:pStyle w:val="9"/>
+        <w:keepNext w:val="0"/>
+        <w:keepLines w:val="0"/>
+        <w:widowControl/>
+        <w:suppressLineNumbers w:val="0"/>
+        <w:spacing w:before="0" w:beforeAutospacing="1" w:after="0" w:afterAutospacing="1"/>
+        <w:ind w:left="0" w:right="0"/>
+        <w:rPr>
+          <w:rFonts w:hint="default"/>
+          <w:b w:val="0"/>
+          <w:bCs w:val="0"/>
+          <w:sz w:val="18"/>
+          <w:szCs w:val="18"/>
+          <w:lang w:val="en-GB"/>
+        </w:rPr>
+      </w:pPr>
+    </w:p>
+    <w:p>
+      <w:pPr>
         <w:spacing w:line="240" w:lineRule="auto"/>
         <w:rPr>
           <w:rFonts w:hint="default" w:ascii="Calibri" w:hAnsi="Calibri" w:cs="Calibri"/>
-          <w:sz w:val="22"/>
-          <w:szCs w:val="22"/>
+          <w:sz w:val="18"/>
+          <w:szCs w:val="18"/>
           <w:lang w:val="en-GB"/>
         </w:rPr>
       </w:pPr>

</xml_diff>